<commit_message>
comp math lab 6
</commit_message>
<xml_diff>
--- a/Computation math/Comp_lab_5/Выч Мат ЛР5 P3215  Линейский А.Е..docx
+++ b/Computation math/Comp_lab_5/Выч Мат ЛР5 P3215  Линейский А.Е..docx
@@ -356,11 +356,11 @@
         <w:t>6</w:t>
       </w:r>
     </w:p>
-    <w:bookmarkStart w:id="0" w:name="_Toc228368599" w:displacedByCustomXml="next"/>
-    <w:bookmarkStart w:id="1" w:name="_Toc178447396" w:displacedByCustomXml="next"/>
+    <w:bookmarkStart w:id="0" w:name="_Toc182062724" w:displacedByCustomXml="next"/>
+    <w:bookmarkStart w:id="1" w:name="_Toc178448935" w:displacedByCustomXml="next"/>
     <w:bookmarkStart w:id="2" w:name="_Toc178448813" w:displacedByCustomXml="next"/>
-    <w:bookmarkStart w:id="3" w:name="_Toc178448935" w:displacedByCustomXml="next"/>
-    <w:bookmarkStart w:id="4" w:name="_Toc182062724" w:displacedByCustomXml="next"/>
+    <w:bookmarkStart w:id="3" w:name="_Toc178447396" w:displacedByCustomXml="next"/>
+    <w:bookmarkStart w:id="4" w:name="_Toc228368599" w:displacedByCustomXml="next"/>
     <w:sdt>
       <w:sdtPr>
         <w:rPr>
@@ -1713,7 +1713,7 @@
                 <w:noProof/>
                 <w:webHidden/>
               </w:rPr>
-              <w:t>12</w:t>
+              <w:t>13</w:t>
             </w:r>
             <w:r>
               <w:rPr>
@@ -2821,21 +2821,12 @@
           <w:iCs/>
         </w:rPr>
       </w:pPr>
-      <w:proofErr w:type="spellStart"/>
       <w:r>
         <w:rPr>
           <w:i/>
           <w:iCs/>
         </w:rPr>
-        <w:t>Табл</w:t>
-      </w:r>
-      <w:proofErr w:type="spellEnd"/>
-      <w:r>
-        <w:rPr>
-          <w:i/>
-          <w:iCs/>
-        </w:rPr>
-        <w:t xml:space="preserve"> 1.</w:t>
+        <w:t>Табл 1.</w:t>
       </w:r>
       <w:r>
         <w:rPr>
@@ -11017,15 +11008,25 @@
         <w:ind w:firstLine="0"/>
         <w:jc w:val="center"/>
       </w:pPr>
+    </w:p>
+    <w:p>
+      <w:pPr>
+        <w:ind w:firstLine="0"/>
+        <w:jc w:val="center"/>
+        <w:rPr>
+          <w:lang w:val="en-US"/>
+        </w:rPr>
+      </w:pPr>
       <w:r>
         <w:rPr>
-          <w:noProof/>
+          <w:lang w:val="en-US"/>
         </w:rPr>
+        <w:lastRenderedPageBreak/>
         <w:drawing>
-          <wp:inline distT="0" distB="0" distL="0" distR="0" wp14:anchorId="5C459AAD" wp14:editId="03DC1EC3">
-            <wp:extent cx="5306869" cy="4868883"/>
-            <wp:effectExtent l="0" t="0" r="8255" b="8255"/>
-            <wp:docPr id="3" name="Рисунок 3"/>
+          <wp:inline distT="0" distB="0" distL="0" distR="0" wp14:anchorId="05F4B557" wp14:editId="0D372F10">
+            <wp:extent cx="5939790" cy="5294630"/>
+            <wp:effectExtent l="0" t="0" r="3810" b="1270"/>
+            <wp:docPr id="8" name="Рисунок 8"/>
             <wp:cNvGraphicFramePr>
               <a:graphicFrameLocks xmlns:a="http://schemas.openxmlformats.org/drawingml/2006/main" noChangeAspect="1"/>
             </wp:cNvGraphicFramePr>
@@ -11045,7 +11046,7 @@
                   <pic:spPr>
                     <a:xfrm>
                       <a:off x="0" y="0"/>
-                      <a:ext cx="5313059" cy="4874562"/>
+                      <a:ext cx="5939790" cy="5294630"/>
                     </a:xfrm>
                     <a:prstGeom prst="rect">
                       <a:avLst/>
@@ -11119,31 +11120,713 @@
               <w:pStyle w:val="af2"/>
             </w:pPr>
             <w:r>
-              <w:t xml:space="preserve">class </w:t>
-            </w:r>
-            <w:proofErr w:type="spellStart"/>
-            <w:r>
-              <w:t>InterpolationMath</w:t>
-            </w:r>
-            <w:proofErr w:type="spellEnd"/>
-            <w:r>
+              <w:t>class InterpolationMath:</w:t>
+            </w:r>
+          </w:p>
+          <w:p>
+            <w:pPr>
+              <w:pStyle w:val="af2"/>
+            </w:pPr>
+            <w:r>
+              <w:t>    def factorial(num):</w:t>
+            </w:r>
+          </w:p>
+          <w:p>
+            <w:pPr>
+              <w:pStyle w:val="af2"/>
+            </w:pPr>
+            <w:r>
+              <w:t>        if num == 0 or num == 1:</w:t>
+            </w:r>
+          </w:p>
+          <w:p>
+            <w:pPr>
+              <w:pStyle w:val="af2"/>
+            </w:pPr>
+            <w:r>
+              <w:t>            return 1</w:t>
+            </w:r>
+          </w:p>
+          <w:p>
+            <w:pPr>
+              <w:pStyle w:val="af2"/>
+            </w:pPr>
+            <w:r>
+              <w:t>        res = 1</w:t>
+            </w:r>
+          </w:p>
+          <w:p>
+            <w:pPr>
+              <w:pStyle w:val="af2"/>
+            </w:pPr>
+            <w:r>
+              <w:t>        for i in range(2, num + 1):</w:t>
+            </w:r>
+          </w:p>
+          <w:p>
+            <w:pPr>
+              <w:pStyle w:val="af2"/>
+            </w:pPr>
+            <w:r>
+              <w:t>            res *= i</w:t>
+            </w:r>
+          </w:p>
+          <w:p>
+            <w:pPr>
+              <w:pStyle w:val="af2"/>
+            </w:pPr>
+            <w:r>
+              <w:t>        return res</w:t>
+            </w:r>
+          </w:p>
+          <w:p>
+            <w:pPr>
+              <w:pStyle w:val="af2"/>
+            </w:pPr>
+            <w:r>
+              <w:t xml:space="preserve">    </w:t>
+            </w:r>
+          </w:p>
+          <w:p>
+            <w:pPr>
+              <w:pStyle w:val="af2"/>
+            </w:pPr>
+            <w:r>
+              <w:t>    def get_finite_diffs(y):</w:t>
+            </w:r>
+          </w:p>
+          <w:p>
+            <w:pPr>
+              <w:pStyle w:val="af2"/>
+            </w:pPr>
+            <w:r>
+              <w:t>        n = len(y)</w:t>
+            </w:r>
+          </w:p>
+          <w:p>
+            <w:pPr>
+              <w:pStyle w:val="af2"/>
+            </w:pPr>
+            <w:r>
+              <w:t>        table = [[] for _ in range(n)]</w:t>
+            </w:r>
+          </w:p>
+          <w:p>
+            <w:pPr>
+              <w:pStyle w:val="af2"/>
+            </w:pPr>
+            <w:r>
+              <w:t>        table[0] = [float(val) for val in y]</w:t>
+            </w:r>
+          </w:p>
+          <w:p>
+            <w:pPr>
+              <w:pStyle w:val="af2"/>
+            </w:pPr>
+          </w:p>
+          <w:p>
+            <w:pPr>
+              <w:pStyle w:val="af2"/>
+            </w:pPr>
+            <w:r>
+              <w:t>        for j in range(1, n):</w:t>
+            </w:r>
+          </w:p>
+          <w:p>
+            <w:pPr>
+              <w:pStyle w:val="af2"/>
+            </w:pPr>
+            <w:r>
+              <w:lastRenderedPageBreak/>
+              <w:t>            for i in range(n - j):</w:t>
+            </w:r>
+          </w:p>
+          <w:p>
+            <w:pPr>
+              <w:pStyle w:val="af2"/>
+            </w:pPr>
+            <w:r>
+              <w:t>                diff = table[j - 1][i + 1] - table[j - 1][i]</w:t>
+            </w:r>
+          </w:p>
+          <w:p>
+            <w:pPr>
+              <w:pStyle w:val="af2"/>
+            </w:pPr>
+            <w:r>
+              <w:t>                table[j].append(diff)</w:t>
+            </w:r>
+          </w:p>
+          <w:p>
+            <w:pPr>
+              <w:pStyle w:val="af2"/>
+            </w:pPr>
+            <w:r>
+              <w:t>        return [np.array(col) for col in table if col]</w:t>
+            </w:r>
+          </w:p>
+          <w:p>
+            <w:pPr>
+              <w:pStyle w:val="af2"/>
+            </w:pPr>
+          </w:p>
+          <w:p>
+            <w:pPr>
+              <w:pStyle w:val="af2"/>
+            </w:pPr>
+            <w:r>
+              <w:t>    @staticmethod</w:t>
+            </w:r>
+          </w:p>
+          <w:p>
+            <w:pPr>
+              <w:pStyle w:val="af2"/>
+            </w:pPr>
+            <w:r>
+              <w:t>    def get_divided_diffs(x, y):</w:t>
+            </w:r>
+          </w:p>
+          <w:p>
+            <w:pPr>
+              <w:pStyle w:val="af2"/>
+            </w:pPr>
+            <w:r>
+              <w:t>        n = len(y)</w:t>
+            </w:r>
+          </w:p>
+          <w:p>
+            <w:pPr>
+              <w:pStyle w:val="af2"/>
+            </w:pPr>
+            <w:r>
+              <w:t>        table = np.zeros((n, n))</w:t>
+            </w:r>
+          </w:p>
+          <w:p>
+            <w:pPr>
+              <w:pStyle w:val="af2"/>
+            </w:pPr>
+            <w:r>
+              <w:t>        table[:, 0] = y</w:t>
+            </w:r>
+          </w:p>
+          <w:p>
+            <w:pPr>
+              <w:pStyle w:val="af2"/>
+            </w:pPr>
+            <w:r>
+              <w:t>        for j in range(1, n):</w:t>
+            </w:r>
+          </w:p>
+          <w:p>
+            <w:pPr>
+              <w:pStyle w:val="af2"/>
+            </w:pPr>
+            <w:r>
+              <w:t>            for i in range(n - j):</w:t>
+            </w:r>
+          </w:p>
+          <w:p>
+            <w:pPr>
+              <w:pStyle w:val="af2"/>
+            </w:pPr>
+            <w:r>
+              <w:t>                table[i][j] = (table[i + 1][j - 1] - table[i][j - 1]) / (</w:t>
+            </w:r>
+          </w:p>
+          <w:p>
+            <w:pPr>
+              <w:pStyle w:val="af2"/>
+            </w:pPr>
+            <w:r>
+              <w:t>                    x[i + j] - x[i]</w:t>
+            </w:r>
+          </w:p>
+          <w:p>
+            <w:pPr>
+              <w:pStyle w:val="af2"/>
+            </w:pPr>
+            <w:r>
+              <w:t>                )</w:t>
+            </w:r>
+          </w:p>
+          <w:p>
+            <w:pPr>
+              <w:pStyle w:val="af2"/>
+            </w:pPr>
+            <w:r>
+              <w:t>        return table</w:t>
+            </w:r>
+          </w:p>
+          <w:p>
+            <w:pPr>
+              <w:pStyle w:val="af2"/>
+            </w:pPr>
+          </w:p>
+          <w:p>
+            <w:pPr>
+              <w:pStyle w:val="af2"/>
+            </w:pPr>
+            <w:r>
+              <w:t>    @staticmethod</w:t>
+            </w:r>
+          </w:p>
+          <w:p>
+            <w:pPr>
+              <w:pStyle w:val="af2"/>
+            </w:pPr>
+            <w:r>
+              <w:t>    def lagrange(x_pts, y_pts, x_val):</w:t>
+            </w:r>
+          </w:p>
+          <w:p>
+            <w:pPr>
+              <w:pStyle w:val="af2"/>
+            </w:pPr>
+            <w:r>
+              <w:t>        n = len(x_pts)</w:t>
+            </w:r>
+          </w:p>
+          <w:p>
+            <w:pPr>
+              <w:pStyle w:val="af2"/>
+            </w:pPr>
+            <w:r>
+              <w:t>        res = 0</w:t>
+            </w:r>
+          </w:p>
+          <w:p>
+            <w:pPr>
+              <w:pStyle w:val="af2"/>
+            </w:pPr>
+            <w:r>
+              <w:t>        for i in range(n):</w:t>
+            </w:r>
+          </w:p>
+          <w:p>
+            <w:pPr>
+              <w:pStyle w:val="af2"/>
+            </w:pPr>
+            <w:r>
+              <w:t>            p = 1</w:t>
+            </w:r>
+          </w:p>
+          <w:p>
+            <w:pPr>
+              <w:pStyle w:val="af2"/>
+            </w:pPr>
+            <w:r>
+              <w:t>            for j in range(n):</w:t>
+            </w:r>
+          </w:p>
+          <w:p>
+            <w:pPr>
+              <w:pStyle w:val="af2"/>
+            </w:pPr>
+            <w:r>
+              <w:t>                if i != j:</w:t>
+            </w:r>
+          </w:p>
+          <w:p>
+            <w:pPr>
+              <w:pStyle w:val="af2"/>
+            </w:pPr>
+            <w:r>
+              <w:t>                    p *= (x_val - x_pts[j]) / (x_pts[i] - x_pts[j])</w:t>
+            </w:r>
+          </w:p>
+          <w:p>
+            <w:pPr>
+              <w:pStyle w:val="af2"/>
+            </w:pPr>
+            <w:r>
+              <w:t>            res += y_pts[i] * p</w:t>
+            </w:r>
+          </w:p>
+          <w:p>
+            <w:pPr>
+              <w:pStyle w:val="af2"/>
+            </w:pPr>
+            <w:r>
+              <w:t>        return res</w:t>
+            </w:r>
+          </w:p>
+          <w:p>
+            <w:pPr>
+              <w:pStyle w:val="af2"/>
+            </w:pPr>
+          </w:p>
+          <w:p>
+            <w:pPr>
+              <w:pStyle w:val="af2"/>
+            </w:pPr>
+            <w:r>
+              <w:t>    @staticmethod</w:t>
+            </w:r>
+          </w:p>
+          <w:p>
+            <w:pPr>
+              <w:pStyle w:val="af2"/>
+            </w:pPr>
+            <w:r>
+              <w:t>    def newton_divided_auto(x_pts, y_pts, x_val):</w:t>
+            </w:r>
+          </w:p>
+          <w:p>
+            <w:pPr>
+              <w:pStyle w:val="af2"/>
+            </w:pPr>
+            <w:r>
+              <w:t>        coef = InterpolationMath.get_divided_diffs(x_pts, y_pts)</w:t>
+            </w:r>
+          </w:p>
+          <w:p>
+            <w:pPr>
+              <w:pStyle w:val="af2"/>
+            </w:pPr>
+            <w:r>
+              <w:t>        n = len(x_pts)</w:t>
+            </w:r>
+          </w:p>
+          <w:p>
+            <w:pPr>
+              <w:pStyle w:val="af2"/>
+            </w:pPr>
+            <w:r>
+              <w:t>        mid_idx = n // 2</w:t>
+            </w:r>
+          </w:p>
+          <w:p>
+            <w:pPr>
+              <w:pStyle w:val="af2"/>
+            </w:pPr>
+          </w:p>
+          <w:p>
+            <w:pPr>
+              <w:pStyle w:val="af2"/>
+            </w:pPr>
+            <w:r>
+              <w:t>        if x_val &lt;= x_pts[mid_idx]:</w:t>
+            </w:r>
+          </w:p>
+          <w:p>
+            <w:pPr>
+              <w:pStyle w:val="af2"/>
+              <w:rPr>
+                <w:lang w:val="ru-RU"/>
+              </w:rPr>
+            </w:pPr>
+            <w:r>
+              <w:t xml:space="preserve">            </w:t>
+            </w:r>
+            <w:r>
+              <w:rPr>
+                <w:lang w:val="ru-RU"/>
+              </w:rPr>
+              <w:t># 1-я формула (вперед)</w:t>
+            </w:r>
+          </w:p>
+          <w:p>
+            <w:pPr>
+              <w:pStyle w:val="af2"/>
+              <w:rPr>
+                <w:lang w:val="ru-RU"/>
+              </w:rPr>
+            </w:pPr>
+            <w:r>
+              <w:rPr>
+                <w:lang w:val="ru-RU"/>
+              </w:rPr>
+              <w:t>            res = float(coef[0, 0])</w:t>
+            </w:r>
+          </w:p>
+          <w:p>
+            <w:pPr>
+              <w:pStyle w:val="af2"/>
+            </w:pPr>
+            <w:r>
+              <w:rPr>
+                <w:lang w:val="ru-RU"/>
+              </w:rPr>
+              <w:t xml:space="preserve">            </w:t>
+            </w:r>
+            <w:r>
+              <w:t>product = 1.0</w:t>
+            </w:r>
+          </w:p>
+          <w:p>
+            <w:pPr>
+              <w:pStyle w:val="af2"/>
+            </w:pPr>
+            <w:r>
+              <w:t>            for i in range(1, n):</w:t>
+            </w:r>
+          </w:p>
+          <w:p>
+            <w:pPr>
+              <w:pStyle w:val="af2"/>
+            </w:pPr>
+            <w:r>
+              <w:t>                product *= x_val - x_pts[i - 1]</w:t>
+            </w:r>
+          </w:p>
+          <w:p>
+            <w:pPr>
+              <w:pStyle w:val="af2"/>
+            </w:pPr>
+            <w:r>
+              <w:t>                res += float(coef[0, i]) * product</w:t>
+            </w:r>
+          </w:p>
+          <w:p>
+            <w:pPr>
+              <w:pStyle w:val="af2"/>
+            </w:pPr>
+            <w:r>
+              <w:t>            return res, "</w:t>
+            </w:r>
+            <w:r>
+              <w:rPr>
+                <w:lang w:val="ru-RU"/>
+              </w:rPr>
+              <w:t>Ньютон</w:t>
+            </w:r>
+            <w:r>
+              <w:t xml:space="preserve"> (</w:t>
+            </w:r>
+            <w:r>
+              <w:rPr>
+                <w:lang w:val="ru-RU"/>
+              </w:rPr>
+              <w:t>разд</w:t>
+            </w:r>
+            <w:r>
+              <w:t xml:space="preserve">. </w:t>
+            </w:r>
+            <w:r>
+              <w:rPr>
+                <w:lang w:val="ru-RU"/>
+              </w:rPr>
+              <w:t>вперед</w:t>
+            </w:r>
+            <w:r>
+              <w:t>)"</w:t>
+            </w:r>
+          </w:p>
+          <w:p>
+            <w:pPr>
+              <w:pStyle w:val="af2"/>
+              <w:rPr>
+                <w:lang w:val="ru-RU"/>
+              </w:rPr>
+            </w:pPr>
+            <w:r>
+              <w:t xml:space="preserve">        </w:t>
+            </w:r>
+            <w:r>
+              <w:t>else</w:t>
+            </w:r>
+            <w:r>
+              <w:rPr>
+                <w:lang w:val="ru-RU"/>
+              </w:rPr>
               <w:t>:</w:t>
             </w:r>
           </w:p>
           <w:p>
             <w:pPr>
               <w:pStyle w:val="af2"/>
-            </w:pPr>
-            <w:r>
-              <w:t>    def factorial(num):</w:t>
+              <w:rPr>
+                <w:lang w:val="ru-RU"/>
+              </w:rPr>
+            </w:pPr>
+            <w:r>
+              <w:t> </w:t>
+            </w:r>
+            <w:r>
+              <w:rPr>
+                <w:lang w:val="ru-RU"/>
+              </w:rPr>
+              <w:t xml:space="preserve"> </w:t>
+            </w:r>
+            <w:r>
+              <w:t> </w:t>
+            </w:r>
+            <w:r>
+              <w:rPr>
+                <w:lang w:val="ru-RU"/>
+              </w:rPr>
+              <w:t xml:space="preserve"> </w:t>
+            </w:r>
+            <w:r>
+              <w:t> </w:t>
+            </w:r>
+            <w:r>
+              <w:rPr>
+                <w:lang w:val="ru-RU"/>
+              </w:rPr>
+              <w:t xml:space="preserve"> </w:t>
+            </w:r>
+            <w:r>
+              <w:t> </w:t>
+            </w:r>
+            <w:r>
+              <w:rPr>
+                <w:lang w:val="ru-RU"/>
+              </w:rPr>
+              <w:t xml:space="preserve"> </w:t>
+            </w:r>
+            <w:r>
+              <w:t> </w:t>
+            </w:r>
+            <w:r>
+              <w:rPr>
+                <w:lang w:val="ru-RU"/>
+              </w:rPr>
+              <w:t xml:space="preserve"> </w:t>
+            </w:r>
+            <w:r>
+              <w:t> </w:t>
+            </w:r>
+            <w:r>
+              <w:rPr>
+                <w:lang w:val="ru-RU"/>
+              </w:rPr>
+              <w:t xml:space="preserve"> # 2-</w:t>
+            </w:r>
+            <w:r>
+              <w:rPr>
+                <w:lang w:val="ru-RU"/>
+              </w:rPr>
+              <w:t>я</w:t>
+            </w:r>
+            <w:r>
+              <w:rPr>
+                <w:lang w:val="ru-RU"/>
+              </w:rPr>
+              <w:t xml:space="preserve"> </w:t>
+            </w:r>
+            <w:r>
+              <w:rPr>
+                <w:lang w:val="ru-RU"/>
+              </w:rPr>
+              <w:t>формула</w:t>
+            </w:r>
+            <w:r>
+              <w:rPr>
+                <w:lang w:val="ru-RU"/>
+              </w:rPr>
+              <w:t xml:space="preserve"> (</w:t>
+            </w:r>
+            <w:r>
+              <w:rPr>
+                <w:lang w:val="ru-RU"/>
+              </w:rPr>
+              <w:t>назад</w:t>
+            </w:r>
+            <w:r>
+              <w:rPr>
+                <w:lang w:val="ru-RU"/>
+              </w:rPr>
+              <w:t>)</w:t>
             </w:r>
           </w:p>
           <w:p>
             <w:pPr>
               <w:pStyle w:val="af2"/>
-            </w:pPr>
-            <w:r>
-              <w:t>        if num == 0 or num == 1:</w:t>
+              <w:rPr>
+                <w:lang w:val="ru-RU"/>
+              </w:rPr>
+            </w:pPr>
+            <w:r>
+              <w:t> </w:t>
+            </w:r>
+            <w:r>
+              <w:rPr>
+                <w:lang w:val="ru-RU"/>
+              </w:rPr>
+              <w:t xml:space="preserve"> </w:t>
+            </w:r>
+            <w:r>
+              <w:t> </w:t>
+            </w:r>
+            <w:r>
+              <w:rPr>
+                <w:lang w:val="ru-RU"/>
+              </w:rPr>
+              <w:t xml:space="preserve"> </w:t>
+            </w:r>
+            <w:r>
+              <w:t> </w:t>
+            </w:r>
+            <w:r>
+              <w:rPr>
+                <w:lang w:val="ru-RU"/>
+              </w:rPr>
+              <w:t xml:space="preserve"> </w:t>
+            </w:r>
+            <w:r>
+              <w:t> </w:t>
+            </w:r>
+            <w:r>
+              <w:rPr>
+                <w:lang w:val="ru-RU"/>
+              </w:rPr>
+              <w:t xml:space="preserve"> </w:t>
+            </w:r>
+            <w:r>
+              <w:t> </w:t>
+            </w:r>
+            <w:r>
+              <w:rPr>
+                <w:lang w:val="ru-RU"/>
+              </w:rPr>
+              <w:t xml:space="preserve"> </w:t>
+            </w:r>
+            <w:r>
+              <w:t> </w:t>
+            </w:r>
+            <w:r>
+              <w:rPr>
+                <w:lang w:val="ru-RU"/>
+              </w:rPr>
+              <w:t xml:space="preserve"> </w:t>
+            </w:r>
+            <w:r>
+              <w:t>res</w:t>
+            </w:r>
+            <w:r>
+              <w:rPr>
+                <w:lang w:val="ru-RU"/>
+              </w:rPr>
+              <w:t xml:space="preserve"> = </w:t>
+            </w:r>
+            <w:r>
+              <w:t>float</w:t>
+            </w:r>
+            <w:r>
+              <w:rPr>
+                <w:lang w:val="ru-RU"/>
+              </w:rPr>
+              <w:t>(</w:t>
+            </w:r>
+            <w:r>
+              <w:t>coef</w:t>
+            </w:r>
+            <w:r>
+              <w:rPr>
+                <w:lang w:val="ru-RU"/>
+              </w:rPr>
+              <w:t>[</w:t>
+            </w:r>
+            <w:r>
+              <w:t>n</w:t>
+            </w:r>
+            <w:r>
+              <w:rPr>
+                <w:lang w:val="ru-RU"/>
+              </w:rPr>
+              <w:t xml:space="preserve"> - 1, 0])</w:t>
             </w:r>
           </w:p>
           <w:p>
@@ -11151,7 +11834,61 @@
               <w:pStyle w:val="af2"/>
             </w:pPr>
             <w:r>
-              <w:t>            return 1</w:t>
+              <w:t> </w:t>
+            </w:r>
+            <w:r>
+              <w:rPr>
+                <w:lang w:val="ru-RU"/>
+              </w:rPr>
+              <w:t xml:space="preserve"> </w:t>
+            </w:r>
+            <w:r>
+              <w:t> </w:t>
+            </w:r>
+            <w:r>
+              <w:rPr>
+                <w:lang w:val="ru-RU"/>
+              </w:rPr>
+              <w:t xml:space="preserve"> </w:t>
+            </w:r>
+            <w:r>
+              <w:t> </w:t>
+            </w:r>
+            <w:r>
+              <w:rPr>
+                <w:lang w:val="ru-RU"/>
+              </w:rPr>
+              <w:t xml:space="preserve"> </w:t>
+            </w:r>
+            <w:r>
+              <w:t> </w:t>
+            </w:r>
+            <w:r>
+              <w:rPr>
+                <w:lang w:val="ru-RU"/>
+              </w:rPr>
+              <w:t xml:space="preserve"> </w:t>
+            </w:r>
+            <w:r>
+              <w:t> </w:t>
+            </w:r>
+            <w:r>
+              <w:rPr>
+                <w:lang w:val="ru-RU"/>
+              </w:rPr>
+              <w:t xml:space="preserve"> </w:t>
+            </w:r>
+            <w:r>
+              <w:t> </w:t>
+            </w:r>
+            <w:r>
+              <w:rPr>
+                <w:lang w:val="ru-RU"/>
+              </w:rPr>
+              <w:t xml:space="preserve"> </w:t>
+            </w:r>
+            <w:r>
+              <w:t>product = 1.0</w:t>
             </w:r>
           </w:p>
           <w:p>
@@ -11159,7 +11896,7 @@
               <w:pStyle w:val="af2"/>
             </w:pPr>
             <w:r>
-              <w:t>        res = 1</w:t>
+              <w:t>            for i in range(1, n):</w:t>
             </w:r>
           </w:p>
           <w:p>
@@ -11167,23 +11904,7 @@
               <w:pStyle w:val="af2"/>
             </w:pPr>
             <w:r>
-              <w:t xml:space="preserve">        for </w:t>
-            </w:r>
-            <w:proofErr w:type="spellStart"/>
-            <w:r>
-              <w:t>i</w:t>
-            </w:r>
-            <w:proofErr w:type="spellEnd"/>
-            <w:r>
-              <w:t xml:space="preserve"> in </w:t>
-            </w:r>
-            <w:proofErr w:type="gramStart"/>
-            <w:r>
-              <w:t>range(</w:t>
-            </w:r>
-            <w:proofErr w:type="gramEnd"/>
-            <w:r>
-              <w:t>2, num + 1):</w:t>
+              <w:t>                product *= x_val - x_pts[n - i]</w:t>
             </w:r>
           </w:p>
           <w:p>
@@ -11191,17 +11912,419 @@
               <w:pStyle w:val="af2"/>
             </w:pPr>
             <w:r>
-              <w:t xml:space="preserve">            res *= </w:t>
-            </w:r>
-            <w:proofErr w:type="spellStart"/>
-            <w:r>
-              <w:t>i</w:t>
-            </w:r>
-            <w:proofErr w:type="spellEnd"/>
+              <w:t>                res += float(coef[n - 1 - i, i]) * product</w:t>
+            </w:r>
           </w:p>
           <w:p>
             <w:pPr>
               <w:pStyle w:val="af2"/>
+              <w:rPr>
+                <w:lang w:val="ru-RU"/>
+              </w:rPr>
+            </w:pPr>
+            <w:r>
+              <w:t xml:space="preserve">            </w:t>
+            </w:r>
+            <w:r>
+              <w:rPr>
+                <w:lang w:val="ru-RU"/>
+              </w:rPr>
+              <w:t>return res, "Ньютон (разд. назад)"</w:t>
+            </w:r>
+          </w:p>
+          <w:p>
+            <w:pPr>
+              <w:pStyle w:val="af2"/>
+              <w:rPr>
+                <w:lang w:val="ru-RU"/>
+              </w:rPr>
+            </w:pPr>
+          </w:p>
+          <w:p>
+            <w:pPr>
+              <w:pStyle w:val="af2"/>
+            </w:pPr>
+            <w:r>
+              <w:rPr>
+                <w:lang w:val="ru-RU"/>
+              </w:rPr>
+              <w:t xml:space="preserve">    </w:t>
+            </w:r>
+            <w:r>
+              <w:t>@staticmethod</w:t>
+            </w:r>
+          </w:p>
+          <w:p>
+            <w:pPr>
+              <w:pStyle w:val="af2"/>
+            </w:pPr>
+            <w:r>
+              <w:lastRenderedPageBreak/>
+              <w:t>    def newton_finite_auto(x_pts, y_pts, x_val):</w:t>
+            </w:r>
+          </w:p>
+          <w:p>
+            <w:pPr>
+              <w:pStyle w:val="af2"/>
+            </w:pPr>
+            <w:r>
+              <w:t>        n = len(x_pts)</w:t>
+            </w:r>
+          </w:p>
+          <w:p>
+            <w:pPr>
+              <w:pStyle w:val="af2"/>
+            </w:pPr>
+            <w:r>
+              <w:t>        h = x_pts[1] - x_pts[0]</w:t>
+            </w:r>
+          </w:p>
+          <w:p>
+            <w:pPr>
+              <w:pStyle w:val="af2"/>
+            </w:pPr>
+            <w:r>
+              <w:t>        diffs = InterpolationMath.get_finite_diffs(y_pts)</w:t>
+            </w:r>
+          </w:p>
+          <w:p>
+            <w:pPr>
+              <w:pStyle w:val="af2"/>
+            </w:pPr>
+            <w:r>
+              <w:t>        mid_idx = n // 2</w:t>
+            </w:r>
+          </w:p>
+          <w:p>
+            <w:pPr>
+              <w:pStyle w:val="af2"/>
+            </w:pPr>
+            <w:r>
+              <w:t>        if x_val &lt;= x_pts[mid_idx]:</w:t>
+            </w:r>
+          </w:p>
+          <w:p>
+            <w:pPr>
+              <w:pStyle w:val="af2"/>
+              <w:rPr>
+                <w:lang w:val="ru-RU"/>
+              </w:rPr>
+            </w:pPr>
+            <w:r>
+              <w:t xml:space="preserve">            </w:t>
+            </w:r>
+            <w:r>
+              <w:rPr>
+                <w:lang w:val="ru-RU"/>
+              </w:rPr>
+              <w:t># 1-я формула (вперед)</w:t>
+            </w:r>
+          </w:p>
+          <w:p>
+            <w:pPr>
+              <w:pStyle w:val="af2"/>
+            </w:pPr>
+            <w:r>
+              <w:rPr>
+                <w:lang w:val="ru-RU"/>
+              </w:rPr>
+              <w:t xml:space="preserve">            </w:t>
+            </w:r>
+            <w:r>
+              <w:t>t = (x_val - x_pts[0]) / h</w:t>
+            </w:r>
+          </w:p>
+          <w:p>
+            <w:pPr>
+              <w:pStyle w:val="af2"/>
+            </w:pPr>
+            <w:r>
+              <w:t xml:space="preserve">            </w:t>
+            </w:r>
+            <w:r>
+              <w:t>res = float(y_pts[0])</w:t>
+            </w:r>
+          </w:p>
+          <w:p>
+            <w:pPr>
+              <w:pStyle w:val="af2"/>
+            </w:pPr>
+            <w:r>
+              <w:t>            term = 1.0</w:t>
+            </w:r>
+          </w:p>
+          <w:p>
+            <w:pPr>
+              <w:pStyle w:val="af2"/>
+            </w:pPr>
+            <w:r>
+              <w:t>            for i in range(1, n):</w:t>
+            </w:r>
+          </w:p>
+          <w:p>
+            <w:pPr>
+              <w:pStyle w:val="af2"/>
+            </w:pPr>
+            <w:r>
+              <w:t>                term *= t - i + 1</w:t>
+            </w:r>
+          </w:p>
+          <w:p>
+            <w:pPr>
+              <w:pStyle w:val="af2"/>
+            </w:pPr>
+            <w:r>
+              <w:t>                res += (term * float(diffs[i][0])) / factorial(i)</w:t>
+            </w:r>
+          </w:p>
+          <w:p>
+            <w:pPr>
+              <w:pStyle w:val="af2"/>
+              <w:rPr>
+                <w:lang w:val="ru-RU"/>
+              </w:rPr>
+            </w:pPr>
+            <w:r>
+              <w:t xml:space="preserve">            </w:t>
+            </w:r>
+            <w:r>
+              <w:rPr>
+                <w:lang w:val="ru-RU"/>
+              </w:rPr>
+              <w:t>return res, "Ньютон (кон. вперед)"</w:t>
+            </w:r>
+          </w:p>
+          <w:p>
+            <w:pPr>
+              <w:pStyle w:val="af2"/>
+              <w:rPr>
+                <w:lang w:val="ru-RU"/>
+              </w:rPr>
+            </w:pPr>
+            <w:r>
+              <w:rPr>
+                <w:lang w:val="ru-RU"/>
+              </w:rPr>
+              <w:t>        else:</w:t>
+            </w:r>
+          </w:p>
+          <w:p>
+            <w:pPr>
+              <w:pStyle w:val="af2"/>
+              <w:rPr>
+                <w:lang w:val="ru-RU"/>
+              </w:rPr>
+            </w:pPr>
+            <w:r>
+              <w:rPr>
+                <w:lang w:val="ru-RU"/>
+              </w:rPr>
+              <w:t>            # 2-я формула (назад)</w:t>
+            </w:r>
+          </w:p>
+          <w:p>
+            <w:pPr>
+              <w:pStyle w:val="af2"/>
+            </w:pPr>
+            <w:r>
+              <w:rPr>
+                <w:lang w:val="ru-RU"/>
+              </w:rPr>
+              <w:t xml:space="preserve">            </w:t>
+            </w:r>
+            <w:r>
+              <w:t>t = (x_val - x_pts[n - 1]) / h</w:t>
+            </w:r>
+          </w:p>
+          <w:p>
+            <w:pPr>
+              <w:pStyle w:val="af2"/>
+            </w:pPr>
+            <w:r>
+              <w:t xml:space="preserve">            </w:t>
+            </w:r>
+            <w:r>
+              <w:t>res = float(y_pts[n - 1])</w:t>
+            </w:r>
+          </w:p>
+          <w:p>
+            <w:pPr>
+              <w:pStyle w:val="af2"/>
+            </w:pPr>
+            <w:r>
+              <w:t>            term = 1.0</w:t>
+            </w:r>
+          </w:p>
+          <w:p>
+            <w:pPr>
+              <w:pStyle w:val="af2"/>
+            </w:pPr>
+            <w:r>
+              <w:t>            for i in range(1, n):</w:t>
+            </w:r>
+          </w:p>
+          <w:p>
+            <w:pPr>
+              <w:pStyle w:val="af2"/>
+            </w:pPr>
+            <w:r>
+              <w:t>                term *= t + i - 1</w:t>
+            </w:r>
+          </w:p>
+          <w:p>
+            <w:pPr>
+              <w:pStyle w:val="af2"/>
+            </w:pPr>
+            <w:r>
+              <w:t>                res += (term * float(diffs[i][-1])) / factorial(i)</w:t>
+            </w:r>
+          </w:p>
+          <w:p>
+            <w:pPr>
+              <w:pStyle w:val="af2"/>
+              <w:rPr>
+                <w:lang w:val="ru-RU"/>
+              </w:rPr>
+            </w:pPr>
+            <w:r>
+              <w:t xml:space="preserve">            </w:t>
+            </w:r>
+            <w:r>
+              <w:rPr>
+                <w:lang w:val="ru-RU"/>
+              </w:rPr>
+              <w:t>return res, "Ньютон (кон. назад)"</w:t>
+            </w:r>
+          </w:p>
+          <w:p>
+            <w:pPr>
+              <w:pStyle w:val="af2"/>
+              <w:rPr>
+                <w:lang w:val="ru-RU"/>
+              </w:rPr>
+            </w:pPr>
+          </w:p>
+          <w:p>
+            <w:pPr>
+              <w:pStyle w:val="af2"/>
+            </w:pPr>
+            <w:r>
+              <w:rPr>
+                <w:lang w:val="ru-RU"/>
+              </w:rPr>
+              <w:t xml:space="preserve">    </w:t>
+            </w:r>
+            <w:r>
+              <w:t>@staticmethod</w:t>
+            </w:r>
+          </w:p>
+          <w:p>
+            <w:pPr>
+              <w:pStyle w:val="af2"/>
+            </w:pPr>
+            <w:r>
+              <w:t>    def stirling(x_pts, y_pts, x_val, diffs):</w:t>
+            </w:r>
+          </w:p>
+          <w:p>
+            <w:pPr>
+              <w:pStyle w:val="af2"/>
+            </w:pPr>
+            <w:r>
+              <w:t>        n = len(x_pts)</w:t>
+            </w:r>
+          </w:p>
+          <w:p>
+            <w:pPr>
+              <w:pStyle w:val="af2"/>
+            </w:pPr>
+            <w:r>
+              <w:t>        mid = n // 2</w:t>
+            </w:r>
+          </w:p>
+          <w:p>
+            <w:pPr>
+              <w:pStyle w:val="af2"/>
+            </w:pPr>
+            <w:r>
+              <w:t>        h = x_pts[1] - x_pts[0]</w:t>
+            </w:r>
+          </w:p>
+          <w:p>
+            <w:pPr>
+              <w:pStyle w:val="af2"/>
+            </w:pPr>
+            <w:r>
+              <w:t>        t = (x_val - x_pts[mid]) / h</w:t>
+            </w:r>
+          </w:p>
+          <w:p>
+            <w:pPr>
+              <w:pStyle w:val="af2"/>
+            </w:pPr>
+            <w:r>
+              <w:t>        res = y_pts[mid]</w:t>
+            </w:r>
+          </w:p>
+          <w:p>
+            <w:pPr>
+              <w:pStyle w:val="af2"/>
+            </w:pPr>
+            <w:r>
+              <w:t>        try:</w:t>
+            </w:r>
+          </w:p>
+          <w:p>
+            <w:pPr>
+              <w:pStyle w:val="af2"/>
+            </w:pPr>
+            <w:r>
+              <w:t>            res += (</w:t>
+            </w:r>
+          </w:p>
+          <w:p>
+            <w:pPr>
+              <w:pStyle w:val="af2"/>
+            </w:pPr>
+            <w:r>
+              <w:t>                t * (diffs[1][mid - 1] + diffs[1][mid]) / 2</w:t>
+            </w:r>
+          </w:p>
+          <w:p>
+            <w:pPr>
+              <w:pStyle w:val="af2"/>
+            </w:pPr>
+            <w:r>
+              <w:t>                + (t**2 / 2) * diffs[2][mid - 1]</w:t>
+            </w:r>
+          </w:p>
+          <w:p>
+            <w:pPr>
+              <w:pStyle w:val="af2"/>
+            </w:pPr>
+            <w:r>
+              <w:t>            )</w:t>
+            </w:r>
+          </w:p>
+          <w:p>
+            <w:pPr>
+              <w:pStyle w:val="af2"/>
+            </w:pPr>
+            <w:r>
+              <w:t>        except:</w:t>
+            </w:r>
+          </w:p>
+          <w:p>
+            <w:pPr>
+              <w:pStyle w:val="af2"/>
+            </w:pPr>
+            <w:r>
+              <w:t>            pass</w:t>
+            </w:r>
+          </w:p>
+          <w:p>
+            <w:pPr>
+              <w:pStyle w:val="af2"/>
             </w:pPr>
             <w:r>
               <w:t>        return res</w:t>
@@ -11211,24 +12334,13 @@
             <w:pPr>
               <w:pStyle w:val="af2"/>
             </w:pPr>
-            <w:r>
-              <w:t xml:space="preserve">    </w:t>
-            </w:r>
           </w:p>
           <w:p>
             <w:pPr>
               <w:pStyle w:val="af2"/>
             </w:pPr>
             <w:r>
-              <w:t xml:space="preserve">    def </w:t>
-            </w:r>
-            <w:proofErr w:type="spellStart"/>
-            <w:r>
-              <w:t>get_finite_diffs</w:t>
-            </w:r>
-            <w:proofErr w:type="spellEnd"/>
-            <w:r>
-              <w:t>(y):</w:t>
+              <w:t>    @staticmethod</w:t>
             </w:r>
           </w:p>
           <w:p>
@@ -11236,15 +12348,7 @@
               <w:pStyle w:val="af2"/>
             </w:pPr>
             <w:r>
-              <w:t xml:space="preserve">        n = </w:t>
-            </w:r>
-            <w:proofErr w:type="spellStart"/>
-            <w:r>
-              <w:t>len</w:t>
-            </w:r>
-            <w:proofErr w:type="spellEnd"/>
-            <w:r>
-              <w:t>(y)</w:t>
+              <w:t>    def bessel(x_pts, y_pts, x_val, diffs):</w:t>
             </w:r>
           </w:p>
           <w:p>
@@ -11252,7 +12356,7 @@
               <w:pStyle w:val="af2"/>
             </w:pPr>
             <w:r>
-              <w:t>        table = [[] for _ in range(n)]</w:t>
+              <w:t>        n = len(x_pts)</w:t>
             </w:r>
           </w:p>
           <w:p>
@@ -11260,2289 +12364,93 @@
               <w:pStyle w:val="af2"/>
             </w:pPr>
             <w:r>
+              <w:t>        mid = (n - 1) // 2</w:t>
+            </w:r>
+          </w:p>
+          <w:p>
+            <w:pPr>
+              <w:pStyle w:val="af2"/>
+            </w:pPr>
+            <w:r>
+              <w:t>        h = x_pts[1] - x_pts[0]</w:t>
+            </w:r>
+          </w:p>
+          <w:p>
+            <w:pPr>
+              <w:pStyle w:val="af2"/>
+            </w:pPr>
+            <w:r>
+              <w:t>        t = (x_val - x_pts[mid]) / h</w:t>
+            </w:r>
+          </w:p>
+          <w:p>
+            <w:pPr>
+              <w:pStyle w:val="af2"/>
+            </w:pPr>
+            <w:r>
+              <w:t>        res = (y_pts[mid] + y_pts[mid + 1]) / 2 + (t - 0.5) * diffs[1][mid]</w:t>
+            </w:r>
+          </w:p>
+          <w:p>
+            <w:pPr>
+              <w:pStyle w:val="af2"/>
+            </w:pPr>
+            <w:r>
+              <w:t>        try:</w:t>
+            </w:r>
+          </w:p>
+          <w:p>
+            <w:pPr>
+              <w:pStyle w:val="af2"/>
+            </w:pPr>
+            <w:r>
+              <w:t>            res += (t * (t - 1) / 2) * (diffs[2][mid - 1] + diffs[2][mid]) / 2</w:t>
+            </w:r>
+          </w:p>
+          <w:p>
+            <w:pPr>
+              <w:pStyle w:val="af2"/>
+              <w:rPr>
+                <w:lang w:val="ru-RU"/>
+              </w:rPr>
+            </w:pPr>
+            <w:r>
               <w:t xml:space="preserve">        </w:t>
             </w:r>
-            <w:proofErr w:type="gramStart"/>
-            <w:r>
-              <w:t>table[</w:t>
-            </w:r>
-            <w:proofErr w:type="gramEnd"/>
-            <w:r>
-              <w:t>0] = [float(</w:t>
-            </w:r>
-            <w:proofErr w:type="spellStart"/>
-            <w:r>
-              <w:t>val</w:t>
-            </w:r>
-            <w:proofErr w:type="spellEnd"/>
-            <w:r>
-              <w:t xml:space="preserve">) for </w:t>
-            </w:r>
-            <w:proofErr w:type="spellStart"/>
-            <w:r>
-              <w:t>val</w:t>
-            </w:r>
-            <w:proofErr w:type="spellEnd"/>
-            <w:r>
-              <w:t xml:space="preserve"> in y]</w:t>
+            <w:r>
+              <w:rPr>
+                <w:lang w:val="ru-RU"/>
+              </w:rPr>
+              <w:t>except:</w:t>
             </w:r>
           </w:p>
           <w:p>
             <w:pPr>
               <w:pStyle w:val="af2"/>
-            </w:pPr>
+              <w:rPr>
+                <w:lang w:val="ru-RU"/>
+              </w:rPr>
+            </w:pPr>
+            <w:r>
+              <w:rPr>
+                <w:lang w:val="ru-RU"/>
+              </w:rPr>
+              <w:t>            pass</w:t>
+            </w:r>
           </w:p>
           <w:p>
             <w:pPr>
               <w:pStyle w:val="af2"/>
-            </w:pPr>
-            <w:r>
-              <w:t xml:space="preserve">        for j in </w:t>
-            </w:r>
-            <w:proofErr w:type="gramStart"/>
-            <w:r>
-              <w:t>range(</w:t>
-            </w:r>
-            <w:proofErr w:type="gramEnd"/>
-            <w:r>
-              <w:t>1, n):</w:t>
-            </w:r>
-          </w:p>
-          <w:p>
-            <w:pPr>
-              <w:pStyle w:val="af2"/>
-            </w:pPr>
-            <w:r>
-              <w:t xml:space="preserve">            for </w:t>
-            </w:r>
-            <w:proofErr w:type="spellStart"/>
-            <w:r>
-              <w:t>i</w:t>
-            </w:r>
-            <w:proofErr w:type="spellEnd"/>
-            <w:r>
-              <w:t xml:space="preserve"> in </w:t>
-            </w:r>
-            <w:proofErr w:type="gramStart"/>
-            <w:r>
-              <w:t>range(</w:t>
-            </w:r>
-            <w:proofErr w:type="gramEnd"/>
-            <w:r>
-              <w:t>n - j):</w:t>
-            </w:r>
-          </w:p>
-          <w:p>
-            <w:pPr>
-              <w:pStyle w:val="af2"/>
-            </w:pPr>
-            <w:r>
-              <w:t xml:space="preserve">                diff = </w:t>
-            </w:r>
-            <w:proofErr w:type="gramStart"/>
-            <w:r>
-              <w:t>table[</w:t>
-            </w:r>
-            <w:proofErr w:type="gramEnd"/>
-            <w:r>
-              <w:t>j - 1][</w:t>
-            </w:r>
-            <w:proofErr w:type="spellStart"/>
-            <w:r>
-              <w:t>i</w:t>
-            </w:r>
-            <w:proofErr w:type="spellEnd"/>
-            <w:r>
-              <w:t xml:space="preserve"> + 1] - table[j - 1][</w:t>
-            </w:r>
-            <w:proofErr w:type="spellStart"/>
-            <w:r>
-              <w:t>i</w:t>
-            </w:r>
-            <w:proofErr w:type="spellEnd"/>
-            <w:r>
-              <w:t>]</w:t>
-            </w:r>
-          </w:p>
-          <w:p>
-            <w:pPr>
-              <w:pStyle w:val="af2"/>
-            </w:pPr>
-            <w:r>
-              <w:t>                table[j</w:t>
-            </w:r>
-            <w:proofErr w:type="gramStart"/>
-            <w:r>
-              <w:t>].append</w:t>
-            </w:r>
-            <w:proofErr w:type="gramEnd"/>
-            <w:r>
-              <w:t>(diff)</w:t>
-            </w:r>
-          </w:p>
-          <w:p>
-            <w:pPr>
-              <w:pStyle w:val="af2"/>
-            </w:pPr>
-            <w:r>
-              <w:t>        return [</w:t>
-            </w:r>
-            <w:proofErr w:type="spellStart"/>
-            <w:proofErr w:type="gramStart"/>
-            <w:r>
-              <w:t>np.array</w:t>
-            </w:r>
-            <w:proofErr w:type="spellEnd"/>
-            <w:proofErr w:type="gramEnd"/>
-            <w:r>
-              <w:t>(col) for col in table if col]</w:t>
-            </w:r>
-          </w:p>
-          <w:p>
-            <w:pPr>
-              <w:pStyle w:val="af2"/>
-            </w:pPr>
-          </w:p>
-          <w:p>
-            <w:pPr>
-              <w:pStyle w:val="af2"/>
-            </w:pPr>
-            <w:r>
-              <w:t>    @staticmethod</w:t>
-            </w:r>
-          </w:p>
-          <w:p>
-            <w:pPr>
-              <w:pStyle w:val="af2"/>
-            </w:pPr>
-            <w:r>
-              <w:t xml:space="preserve">    def </w:t>
-            </w:r>
-            <w:proofErr w:type="spellStart"/>
-            <w:r>
-              <w:t>get_divided_</w:t>
-            </w:r>
-            <w:proofErr w:type="gramStart"/>
-            <w:r>
-              <w:t>diffs</w:t>
-            </w:r>
-            <w:proofErr w:type="spellEnd"/>
-            <w:r>
-              <w:t>(</w:t>
-            </w:r>
-            <w:proofErr w:type="gramEnd"/>
-            <w:r>
-              <w:t>x, y):</w:t>
-            </w:r>
-          </w:p>
-          <w:p>
-            <w:pPr>
-              <w:pStyle w:val="af2"/>
-            </w:pPr>
-            <w:r>
-              <w:t xml:space="preserve">        n = </w:t>
-            </w:r>
-            <w:proofErr w:type="spellStart"/>
-            <w:r>
-              <w:t>len</w:t>
-            </w:r>
-            <w:proofErr w:type="spellEnd"/>
-            <w:r>
-              <w:t>(y)</w:t>
-            </w:r>
-          </w:p>
-          <w:p>
-            <w:pPr>
-              <w:pStyle w:val="af2"/>
-            </w:pPr>
-            <w:r>
-              <w:t xml:space="preserve">        table = </w:t>
-            </w:r>
-            <w:proofErr w:type="spellStart"/>
-            <w:proofErr w:type="gramStart"/>
-            <w:r>
-              <w:t>np.zeros</w:t>
-            </w:r>
-            <w:proofErr w:type="spellEnd"/>
-            <w:proofErr w:type="gramEnd"/>
-            <w:r>
-              <w:t>((n, n))</w:t>
-            </w:r>
-          </w:p>
-          <w:p>
-            <w:pPr>
-              <w:pStyle w:val="af2"/>
-            </w:pPr>
-            <w:r>
-              <w:t>        table</w:t>
-            </w:r>
-            <w:proofErr w:type="gramStart"/>
-            <w:r>
-              <w:t>[:,</w:t>
-            </w:r>
-            <w:proofErr w:type="gramEnd"/>
-            <w:r>
-              <w:t xml:space="preserve"> 0] = y</w:t>
-            </w:r>
-          </w:p>
-          <w:p>
-            <w:pPr>
-              <w:pStyle w:val="af2"/>
-            </w:pPr>
-            <w:r>
-              <w:t xml:space="preserve">        for j in </w:t>
-            </w:r>
-            <w:proofErr w:type="gramStart"/>
-            <w:r>
-              <w:t>range(</w:t>
-            </w:r>
-            <w:proofErr w:type="gramEnd"/>
-            <w:r>
-              <w:t>1, n):</w:t>
-            </w:r>
-          </w:p>
-          <w:p>
-            <w:pPr>
-              <w:pStyle w:val="af2"/>
-            </w:pPr>
-            <w:r>
-              <w:t xml:space="preserve">            for </w:t>
-            </w:r>
-            <w:proofErr w:type="spellStart"/>
-            <w:r>
-              <w:t>i</w:t>
-            </w:r>
-            <w:proofErr w:type="spellEnd"/>
-            <w:r>
-              <w:t xml:space="preserve"> in </w:t>
-            </w:r>
-            <w:proofErr w:type="gramStart"/>
-            <w:r>
-              <w:t>range(</w:t>
-            </w:r>
-            <w:proofErr w:type="gramEnd"/>
-            <w:r>
-              <w:t>n - j):</w:t>
-            </w:r>
-          </w:p>
-          <w:p>
-            <w:pPr>
-              <w:pStyle w:val="af2"/>
-            </w:pPr>
-            <w:r>
-              <w:t>                table[</w:t>
-            </w:r>
-            <w:proofErr w:type="spellStart"/>
-            <w:r>
-              <w:t>i</w:t>
-            </w:r>
-            <w:proofErr w:type="spellEnd"/>
-            <w:r>
-              <w:t>][j] = (</w:t>
-            </w:r>
-            <w:proofErr w:type="gramStart"/>
-            <w:r>
-              <w:t>table[</w:t>
-            </w:r>
-            <w:proofErr w:type="spellStart"/>
-            <w:proofErr w:type="gramEnd"/>
-            <w:r>
-              <w:t>i</w:t>
-            </w:r>
-            <w:proofErr w:type="spellEnd"/>
-            <w:r>
-              <w:t xml:space="preserve"> + 1][j - 1] - table[</w:t>
-            </w:r>
-            <w:proofErr w:type="spellStart"/>
-            <w:r>
-              <w:t>i</w:t>
-            </w:r>
-            <w:proofErr w:type="spellEnd"/>
-            <w:r>
-              <w:t>][j - 1]) / (</w:t>
-            </w:r>
-          </w:p>
-          <w:p>
-            <w:pPr>
-              <w:pStyle w:val="af2"/>
-            </w:pPr>
-            <w:r>
-              <w:t xml:space="preserve">                    </w:t>
-            </w:r>
-            <w:proofErr w:type="gramStart"/>
-            <w:r>
-              <w:t>x[</w:t>
-            </w:r>
-            <w:proofErr w:type="spellStart"/>
-            <w:proofErr w:type="gramEnd"/>
-            <w:r>
-              <w:t>i</w:t>
-            </w:r>
-            <w:proofErr w:type="spellEnd"/>
-            <w:r>
-              <w:t xml:space="preserve"> + j] - x[</w:t>
-            </w:r>
-            <w:proofErr w:type="spellStart"/>
-            <w:r>
-              <w:t>i</w:t>
-            </w:r>
-            <w:proofErr w:type="spellEnd"/>
-            <w:r>
-              <w:t>]</w:t>
-            </w:r>
-          </w:p>
-          <w:p>
-            <w:pPr>
-              <w:pStyle w:val="af2"/>
-            </w:pPr>
-            <w:r>
-              <w:t>                )</w:t>
-            </w:r>
-          </w:p>
-          <w:p>
-            <w:pPr>
-              <w:pStyle w:val="af2"/>
-            </w:pPr>
-            <w:r>
-              <w:t>        return table</w:t>
-            </w:r>
-          </w:p>
-          <w:p>
-            <w:pPr>
-              <w:pStyle w:val="af2"/>
-            </w:pPr>
-          </w:p>
-          <w:p>
-            <w:pPr>
-              <w:pStyle w:val="af2"/>
-            </w:pPr>
-            <w:r>
-              <w:t>    @staticmethod</w:t>
-            </w:r>
-          </w:p>
-          <w:p>
-            <w:pPr>
-              <w:pStyle w:val="af2"/>
-            </w:pPr>
-            <w:r>
-              <w:t xml:space="preserve">    def </w:t>
-            </w:r>
-            <w:proofErr w:type="spellStart"/>
-            <w:proofErr w:type="gramStart"/>
-            <w:r>
-              <w:t>lagrange</w:t>
-            </w:r>
-            <w:proofErr w:type="spellEnd"/>
-            <w:r>
-              <w:t>(</w:t>
-            </w:r>
-            <w:proofErr w:type="spellStart"/>
-            <w:proofErr w:type="gramEnd"/>
-            <w:r>
-              <w:t>x_pts</w:t>
-            </w:r>
-            <w:proofErr w:type="spellEnd"/>
-            <w:r>
-              <w:t xml:space="preserve">, </w:t>
-            </w:r>
-            <w:proofErr w:type="spellStart"/>
-            <w:r>
-              <w:t>y_pts</w:t>
-            </w:r>
-            <w:proofErr w:type="spellEnd"/>
-            <w:r>
-              <w:t xml:space="preserve">, </w:t>
-            </w:r>
-            <w:proofErr w:type="spellStart"/>
-            <w:r>
-              <w:t>x_val</w:t>
-            </w:r>
-            <w:proofErr w:type="spellEnd"/>
-            <w:r>
-              <w:t>):</w:t>
-            </w:r>
-          </w:p>
-          <w:p>
-            <w:pPr>
-              <w:pStyle w:val="af2"/>
-            </w:pPr>
-            <w:r>
-              <w:t xml:space="preserve">        n = </w:t>
-            </w:r>
-            <w:proofErr w:type="spellStart"/>
-            <w:r>
-              <w:t>len</w:t>
-            </w:r>
-            <w:proofErr w:type="spellEnd"/>
-            <w:r>
-              <w:t>(</w:t>
-            </w:r>
-            <w:proofErr w:type="spellStart"/>
-            <w:r>
-              <w:t>x_pts</w:t>
-            </w:r>
-            <w:proofErr w:type="spellEnd"/>
-            <w:r>
-              <w:t>)</w:t>
-            </w:r>
-          </w:p>
-          <w:p>
-            <w:pPr>
-              <w:pStyle w:val="af2"/>
-            </w:pPr>
-            <w:r>
-              <w:t>        res = 0</w:t>
-            </w:r>
-          </w:p>
-          <w:p>
-            <w:pPr>
-              <w:pStyle w:val="af2"/>
-            </w:pPr>
-            <w:r>
-              <w:t xml:space="preserve">        for </w:t>
-            </w:r>
-            <w:proofErr w:type="spellStart"/>
-            <w:r>
-              <w:t>i</w:t>
-            </w:r>
-            <w:proofErr w:type="spellEnd"/>
-            <w:r>
-              <w:t xml:space="preserve"> in range(n):</w:t>
-            </w:r>
-          </w:p>
-          <w:p>
-            <w:pPr>
-              <w:pStyle w:val="af2"/>
-            </w:pPr>
-            <w:r>
-              <w:t>            p = 1</w:t>
-            </w:r>
-          </w:p>
-          <w:p>
-            <w:pPr>
-              <w:pStyle w:val="af2"/>
-            </w:pPr>
-            <w:r>
-              <w:t>            for j in range(n):</w:t>
-            </w:r>
-          </w:p>
-          <w:p>
-            <w:pPr>
-              <w:pStyle w:val="af2"/>
-            </w:pPr>
-            <w:r>
-              <w:t xml:space="preserve">                if </w:t>
-            </w:r>
-            <w:proofErr w:type="spellStart"/>
-            <w:proofErr w:type="gramStart"/>
-            <w:r>
-              <w:t>i</w:t>
-            </w:r>
-            <w:proofErr w:type="spellEnd"/>
-            <w:r>
-              <w:t xml:space="preserve"> !</w:t>
-            </w:r>
-            <w:proofErr w:type="gramEnd"/>
-            <w:r>
-              <w:t>= j:</w:t>
-            </w:r>
-          </w:p>
-          <w:p>
-            <w:pPr>
-              <w:pStyle w:val="af2"/>
-            </w:pPr>
-            <w:r>
-              <w:t>                    p *= (</w:t>
-            </w:r>
-            <w:proofErr w:type="spellStart"/>
-            <w:r>
-              <w:t>x_val</w:t>
-            </w:r>
-            <w:proofErr w:type="spellEnd"/>
-            <w:r>
-              <w:t xml:space="preserve"> - </w:t>
-            </w:r>
-            <w:proofErr w:type="spellStart"/>
-            <w:r>
-              <w:t>x_pts</w:t>
-            </w:r>
-            <w:proofErr w:type="spellEnd"/>
-            <w:r>
-              <w:t>[j]) / (</w:t>
-            </w:r>
-            <w:proofErr w:type="spellStart"/>
-            <w:r>
-              <w:t>x_pts</w:t>
-            </w:r>
-            <w:proofErr w:type="spellEnd"/>
-            <w:r>
-              <w:t>[</w:t>
-            </w:r>
-            <w:proofErr w:type="spellStart"/>
-            <w:r>
-              <w:t>i</w:t>
-            </w:r>
-            <w:proofErr w:type="spellEnd"/>
-            <w:r>
-              <w:t xml:space="preserve">] - </w:t>
-            </w:r>
-            <w:proofErr w:type="spellStart"/>
-            <w:r>
-              <w:t>x_pts</w:t>
-            </w:r>
-            <w:proofErr w:type="spellEnd"/>
-            <w:r>
-              <w:t>[j])</w:t>
-            </w:r>
-          </w:p>
-          <w:p>
-            <w:pPr>
-              <w:pStyle w:val="af2"/>
-            </w:pPr>
-            <w:r>
-              <w:t xml:space="preserve">            res += </w:t>
-            </w:r>
-            <w:proofErr w:type="spellStart"/>
-            <w:r>
-              <w:t>y_pts</w:t>
-            </w:r>
-            <w:proofErr w:type="spellEnd"/>
-            <w:r>
-              <w:t>[</w:t>
-            </w:r>
-            <w:proofErr w:type="spellStart"/>
-            <w:r>
-              <w:t>i</w:t>
-            </w:r>
-            <w:proofErr w:type="spellEnd"/>
-            <w:r>
-              <w:t>] * p</w:t>
-            </w:r>
-          </w:p>
-          <w:p>
-            <w:pPr>
-              <w:pStyle w:val="af2"/>
-            </w:pPr>
-            <w:r>
+              <w:rPr>
+                <w:lang w:val="ru-RU"/>
+              </w:rPr>
+            </w:pPr>
+            <w:r>
+              <w:rPr>
+                <w:lang w:val="ru-RU"/>
+              </w:rPr>
               <w:t>        return res</w:t>
             </w:r>
-          </w:p>
-          <w:p>
-            <w:pPr>
-              <w:pStyle w:val="af2"/>
-            </w:pPr>
-          </w:p>
-          <w:p>
-            <w:pPr>
-              <w:pStyle w:val="af2"/>
-            </w:pPr>
-            <w:r>
-              <w:t>    @staticmethod</w:t>
-            </w:r>
-          </w:p>
-          <w:p>
-            <w:pPr>
-              <w:pStyle w:val="af2"/>
-            </w:pPr>
-            <w:r>
-              <w:t xml:space="preserve">    def </w:t>
-            </w:r>
-            <w:proofErr w:type="spellStart"/>
-            <w:r>
-              <w:t>newton_divided_</w:t>
-            </w:r>
-            <w:proofErr w:type="gramStart"/>
-            <w:r>
-              <w:t>auto</w:t>
-            </w:r>
-            <w:proofErr w:type="spellEnd"/>
-            <w:r>
-              <w:t>(</w:t>
-            </w:r>
-            <w:proofErr w:type="spellStart"/>
-            <w:proofErr w:type="gramEnd"/>
-            <w:r>
-              <w:t>x_pts</w:t>
-            </w:r>
-            <w:proofErr w:type="spellEnd"/>
-            <w:r>
-              <w:t xml:space="preserve">, </w:t>
-            </w:r>
-            <w:proofErr w:type="spellStart"/>
-            <w:r>
-              <w:t>y_pts</w:t>
-            </w:r>
-            <w:proofErr w:type="spellEnd"/>
-            <w:r>
-              <w:t xml:space="preserve">, </w:t>
-            </w:r>
-            <w:proofErr w:type="spellStart"/>
-            <w:r>
-              <w:t>x_val</w:t>
-            </w:r>
-            <w:proofErr w:type="spellEnd"/>
-            <w:r>
-              <w:t>):</w:t>
-            </w:r>
-          </w:p>
-          <w:p>
-            <w:pPr>
-              <w:pStyle w:val="af2"/>
-            </w:pPr>
-            <w:r>
-              <w:lastRenderedPageBreak/>
-              <w:t xml:space="preserve">        </w:t>
-            </w:r>
-            <w:proofErr w:type="spellStart"/>
-            <w:r>
-              <w:t>coef</w:t>
-            </w:r>
-            <w:proofErr w:type="spellEnd"/>
-            <w:r>
-              <w:t xml:space="preserve"> = </w:t>
-            </w:r>
-            <w:proofErr w:type="spellStart"/>
-            <w:r>
-              <w:t>InterpolationMath.get_divided_</w:t>
-            </w:r>
-            <w:proofErr w:type="gramStart"/>
-            <w:r>
-              <w:t>diffs</w:t>
-            </w:r>
-            <w:proofErr w:type="spellEnd"/>
-            <w:r>
-              <w:t>(</w:t>
-            </w:r>
-            <w:proofErr w:type="spellStart"/>
-            <w:proofErr w:type="gramEnd"/>
-            <w:r>
-              <w:t>x_pts</w:t>
-            </w:r>
-            <w:proofErr w:type="spellEnd"/>
-            <w:r>
-              <w:t xml:space="preserve">, </w:t>
-            </w:r>
-            <w:proofErr w:type="spellStart"/>
-            <w:r>
-              <w:t>y_pts</w:t>
-            </w:r>
-            <w:proofErr w:type="spellEnd"/>
-            <w:r>
-              <w:t>)</w:t>
-            </w:r>
-          </w:p>
-          <w:p>
-            <w:pPr>
-              <w:pStyle w:val="af2"/>
-            </w:pPr>
-            <w:r>
-              <w:t xml:space="preserve">        n = </w:t>
-            </w:r>
-            <w:proofErr w:type="spellStart"/>
-            <w:r>
-              <w:t>len</w:t>
-            </w:r>
-            <w:proofErr w:type="spellEnd"/>
-            <w:r>
-              <w:t>(</w:t>
-            </w:r>
-            <w:proofErr w:type="spellStart"/>
-            <w:r>
-              <w:t>x_pts</w:t>
-            </w:r>
-            <w:proofErr w:type="spellEnd"/>
-            <w:r>
-              <w:t>)</w:t>
-            </w:r>
-          </w:p>
-          <w:p>
-            <w:pPr>
-              <w:pStyle w:val="af2"/>
-            </w:pPr>
-            <w:r>
-              <w:t xml:space="preserve">        </w:t>
-            </w:r>
-            <w:proofErr w:type="spellStart"/>
-            <w:r>
-              <w:t>mid_idx</w:t>
-            </w:r>
-            <w:proofErr w:type="spellEnd"/>
-            <w:r>
-              <w:t xml:space="preserve"> = n // 2</w:t>
-            </w:r>
-          </w:p>
-          <w:p>
-            <w:pPr>
-              <w:pStyle w:val="af2"/>
-            </w:pPr>
-          </w:p>
-          <w:p>
-            <w:pPr>
-              <w:pStyle w:val="af2"/>
-            </w:pPr>
-            <w:r>
-              <w:t xml:space="preserve">        if </w:t>
-            </w:r>
-            <w:proofErr w:type="spellStart"/>
-            <w:r>
-              <w:t>x_val</w:t>
-            </w:r>
-            <w:proofErr w:type="spellEnd"/>
-            <w:r>
-              <w:t xml:space="preserve"> &lt;= </w:t>
-            </w:r>
-            <w:proofErr w:type="spellStart"/>
-            <w:r>
-              <w:t>x_pts</w:t>
-            </w:r>
-            <w:proofErr w:type="spellEnd"/>
-            <w:r>
-              <w:t>[</w:t>
-            </w:r>
-            <w:proofErr w:type="spellStart"/>
-            <w:r>
-              <w:t>mid_idx</w:t>
-            </w:r>
-            <w:proofErr w:type="spellEnd"/>
-            <w:r>
-              <w:t>]:</w:t>
-            </w:r>
-          </w:p>
-          <w:p>
-            <w:pPr>
-              <w:pStyle w:val="af2"/>
-              <w:rPr>
-                <w:lang w:val="ru-RU"/>
-              </w:rPr>
-            </w:pPr>
-            <w:r>
-              <w:t xml:space="preserve">            </w:t>
-            </w:r>
-            <w:r>
-              <w:rPr>
-                <w:lang w:val="ru-RU"/>
-              </w:rPr>
-              <w:t># 1-я формула (вперед)</w:t>
-            </w:r>
-          </w:p>
-          <w:p>
-            <w:pPr>
-              <w:pStyle w:val="af2"/>
-              <w:rPr>
-                <w:lang w:val="ru-RU"/>
-              </w:rPr>
-            </w:pPr>
-            <w:r>
-              <w:rPr>
-                <w:lang w:val="ru-RU"/>
-              </w:rPr>
-              <w:t xml:space="preserve">            </w:t>
-            </w:r>
-            <w:proofErr w:type="spellStart"/>
-            <w:r>
-              <w:rPr>
-                <w:lang w:val="ru-RU"/>
-              </w:rPr>
-              <w:t>res</w:t>
-            </w:r>
-            <w:proofErr w:type="spellEnd"/>
-            <w:r>
-              <w:rPr>
-                <w:lang w:val="ru-RU"/>
-              </w:rPr>
-              <w:t xml:space="preserve"> = </w:t>
-            </w:r>
-            <w:proofErr w:type="spellStart"/>
-            <w:proofErr w:type="gramStart"/>
-            <w:r>
-              <w:rPr>
-                <w:lang w:val="ru-RU"/>
-              </w:rPr>
-              <w:t>float</w:t>
-            </w:r>
-            <w:proofErr w:type="spellEnd"/>
-            <w:r>
-              <w:rPr>
-                <w:lang w:val="ru-RU"/>
-              </w:rPr>
-              <w:t>(</w:t>
-            </w:r>
-            <w:proofErr w:type="spellStart"/>
-            <w:proofErr w:type="gramEnd"/>
-            <w:r>
-              <w:rPr>
-                <w:lang w:val="ru-RU"/>
-              </w:rPr>
-              <w:t>coef</w:t>
-            </w:r>
-            <w:proofErr w:type="spellEnd"/>
-            <w:r>
-              <w:rPr>
-                <w:lang w:val="ru-RU"/>
-              </w:rPr>
-              <w:t>[0, 0])</w:t>
-            </w:r>
-          </w:p>
-          <w:p>
-            <w:pPr>
-              <w:pStyle w:val="af2"/>
-            </w:pPr>
-            <w:r>
-              <w:rPr>
-                <w:lang w:val="ru-RU"/>
-              </w:rPr>
-              <w:t xml:space="preserve">            </w:t>
-            </w:r>
-            <w:r>
-              <w:t>product = 1.0</w:t>
-            </w:r>
-          </w:p>
-          <w:p>
-            <w:pPr>
-              <w:pStyle w:val="af2"/>
-            </w:pPr>
-            <w:r>
-              <w:t xml:space="preserve">            for </w:t>
-            </w:r>
-            <w:proofErr w:type="spellStart"/>
-            <w:r>
-              <w:t>i</w:t>
-            </w:r>
-            <w:proofErr w:type="spellEnd"/>
-            <w:r>
-              <w:t xml:space="preserve"> in </w:t>
-            </w:r>
-            <w:proofErr w:type="gramStart"/>
-            <w:r>
-              <w:t>range(</w:t>
-            </w:r>
-            <w:proofErr w:type="gramEnd"/>
-            <w:r>
-              <w:t>1, n):</w:t>
-            </w:r>
-          </w:p>
-          <w:p>
-            <w:pPr>
-              <w:pStyle w:val="af2"/>
-            </w:pPr>
-            <w:r>
-              <w:t xml:space="preserve">                product *= </w:t>
-            </w:r>
-            <w:proofErr w:type="spellStart"/>
-            <w:r>
-              <w:t>x_val</w:t>
-            </w:r>
-            <w:proofErr w:type="spellEnd"/>
-            <w:r>
-              <w:t xml:space="preserve"> - </w:t>
-            </w:r>
-            <w:proofErr w:type="spellStart"/>
-            <w:r>
-              <w:t>x_</w:t>
-            </w:r>
-            <w:proofErr w:type="gramStart"/>
-            <w:r>
-              <w:t>pts</w:t>
-            </w:r>
-            <w:proofErr w:type="spellEnd"/>
-            <w:r>
-              <w:t>[</w:t>
-            </w:r>
-            <w:proofErr w:type="spellStart"/>
-            <w:proofErr w:type="gramEnd"/>
-            <w:r>
-              <w:t>i</w:t>
-            </w:r>
-            <w:proofErr w:type="spellEnd"/>
-            <w:r>
-              <w:t xml:space="preserve"> - 1]</w:t>
-            </w:r>
-          </w:p>
-          <w:p>
-            <w:pPr>
-              <w:pStyle w:val="af2"/>
-            </w:pPr>
-            <w:r>
-              <w:t xml:space="preserve">                res += </w:t>
-            </w:r>
-            <w:proofErr w:type="gramStart"/>
-            <w:r>
-              <w:t>float(</w:t>
-            </w:r>
-            <w:proofErr w:type="spellStart"/>
-            <w:proofErr w:type="gramEnd"/>
-            <w:r>
-              <w:t>coef</w:t>
-            </w:r>
-            <w:proofErr w:type="spellEnd"/>
-            <w:r>
-              <w:t>[0, i]) * product</w:t>
-            </w:r>
-          </w:p>
-          <w:p>
-            <w:pPr>
-              <w:pStyle w:val="af2"/>
-            </w:pPr>
-            <w:r>
-              <w:t>            return res, "</w:t>
-            </w:r>
-            <w:r>
-              <w:rPr>
-                <w:lang w:val="ru-RU"/>
-              </w:rPr>
-              <w:t>Ньютон</w:t>
-            </w:r>
-            <w:r>
-              <w:t xml:space="preserve"> (</w:t>
-            </w:r>
-            <w:proofErr w:type="spellStart"/>
-            <w:r>
-              <w:rPr>
-                <w:lang w:val="ru-RU"/>
-              </w:rPr>
-              <w:t>разд</w:t>
-            </w:r>
-            <w:proofErr w:type="spellEnd"/>
-            <w:r>
-              <w:t xml:space="preserve">. </w:t>
-            </w:r>
-            <w:r>
-              <w:rPr>
-                <w:lang w:val="ru-RU"/>
-              </w:rPr>
-              <w:t>вперед</w:t>
-            </w:r>
-            <w:r>
-              <w:t>)"</w:t>
-            </w:r>
-          </w:p>
-          <w:p>
-            <w:pPr>
-              <w:pStyle w:val="af2"/>
-            </w:pPr>
-            <w:r>
-              <w:t xml:space="preserve">        </w:t>
-            </w:r>
-            <w:r>
-              <w:t>else:</w:t>
-            </w:r>
-          </w:p>
-          <w:p>
-            <w:pPr>
-              <w:pStyle w:val="af2"/>
-            </w:pPr>
-            <w:r>
-              <w:t>            # 2-</w:t>
-            </w:r>
-            <w:r>
-              <w:rPr>
-                <w:lang w:val="ru-RU"/>
-              </w:rPr>
-              <w:t>я</w:t>
-            </w:r>
-            <w:r>
-              <w:t xml:space="preserve"> </w:t>
-            </w:r>
-            <w:r>
-              <w:rPr>
-                <w:lang w:val="ru-RU"/>
-              </w:rPr>
-              <w:t>формула</w:t>
-            </w:r>
-            <w:r>
-              <w:t xml:space="preserve"> (</w:t>
-            </w:r>
-            <w:r>
-              <w:rPr>
-                <w:lang w:val="ru-RU"/>
-              </w:rPr>
-              <w:t>назад</w:t>
-            </w:r>
-            <w:r>
-              <w:t>)</w:t>
-            </w:r>
-          </w:p>
-          <w:p>
-            <w:pPr>
-              <w:pStyle w:val="af2"/>
-            </w:pPr>
-            <w:r>
-              <w:t>            res = float(coef[n - 1, 0])</w:t>
-            </w:r>
-          </w:p>
-          <w:p>
-            <w:pPr>
-              <w:pStyle w:val="af2"/>
-            </w:pPr>
-            <w:r>
-              <w:t xml:space="preserve">            </w:t>
-            </w:r>
-            <w:r>
-              <w:t>product = 1.0</w:t>
-            </w:r>
-          </w:p>
-          <w:p>
-            <w:pPr>
-              <w:pStyle w:val="af2"/>
-            </w:pPr>
-            <w:r>
-              <w:t xml:space="preserve">            for </w:t>
-            </w:r>
-            <w:proofErr w:type="spellStart"/>
-            <w:r>
-              <w:t>i</w:t>
-            </w:r>
-            <w:proofErr w:type="spellEnd"/>
-            <w:r>
-              <w:t xml:space="preserve"> in </w:t>
-            </w:r>
-            <w:proofErr w:type="gramStart"/>
-            <w:r>
-              <w:t>range(</w:t>
-            </w:r>
-            <w:proofErr w:type="gramEnd"/>
-            <w:r>
-              <w:t>1, n):</w:t>
-            </w:r>
-          </w:p>
-          <w:p>
-            <w:pPr>
-              <w:pStyle w:val="af2"/>
-            </w:pPr>
-            <w:r>
-              <w:t xml:space="preserve">                product *= </w:t>
-            </w:r>
-            <w:proofErr w:type="spellStart"/>
-            <w:r>
-              <w:t>x_val</w:t>
-            </w:r>
-            <w:proofErr w:type="spellEnd"/>
-            <w:r>
-              <w:t xml:space="preserve"> - </w:t>
-            </w:r>
-            <w:proofErr w:type="spellStart"/>
-            <w:r>
-              <w:t>x_</w:t>
-            </w:r>
-            <w:proofErr w:type="gramStart"/>
-            <w:r>
-              <w:t>pts</w:t>
-            </w:r>
-            <w:proofErr w:type="spellEnd"/>
-            <w:r>
-              <w:t>[</w:t>
-            </w:r>
-            <w:proofErr w:type="gramEnd"/>
-            <w:r>
-              <w:t xml:space="preserve">n - </w:t>
-            </w:r>
-            <w:proofErr w:type="spellStart"/>
-            <w:r>
-              <w:t>i</w:t>
-            </w:r>
-            <w:proofErr w:type="spellEnd"/>
-            <w:r>
-              <w:t>]</w:t>
-            </w:r>
-          </w:p>
-          <w:p>
-            <w:pPr>
-              <w:pStyle w:val="af2"/>
-            </w:pPr>
-            <w:r>
-              <w:t xml:space="preserve">                res += </w:t>
-            </w:r>
-            <w:proofErr w:type="gramStart"/>
-            <w:r>
-              <w:t>float(</w:t>
-            </w:r>
-            <w:proofErr w:type="spellStart"/>
-            <w:proofErr w:type="gramEnd"/>
-            <w:r>
-              <w:t>coef</w:t>
-            </w:r>
-            <w:proofErr w:type="spellEnd"/>
-            <w:r>
-              <w:t xml:space="preserve">[n - 1 - </w:t>
-            </w:r>
-            <w:proofErr w:type="spellStart"/>
-            <w:r>
-              <w:t>i</w:t>
-            </w:r>
-            <w:proofErr w:type="spellEnd"/>
-            <w:r>
-              <w:t>, i]) * product</w:t>
-            </w:r>
-          </w:p>
-          <w:p>
-            <w:pPr>
-              <w:pStyle w:val="af2"/>
-              <w:rPr>
-                <w:lang w:val="ru-RU"/>
-              </w:rPr>
-            </w:pPr>
-            <w:r>
-              <w:t xml:space="preserve">            </w:t>
-            </w:r>
-            <w:proofErr w:type="spellStart"/>
-            <w:r>
-              <w:rPr>
-                <w:lang w:val="ru-RU"/>
-              </w:rPr>
-              <w:t>return</w:t>
-            </w:r>
-            <w:proofErr w:type="spellEnd"/>
-            <w:r>
-              <w:rPr>
-                <w:lang w:val="ru-RU"/>
-              </w:rPr>
-              <w:t xml:space="preserve"> </w:t>
-            </w:r>
-            <w:proofErr w:type="spellStart"/>
-            <w:r>
-              <w:rPr>
-                <w:lang w:val="ru-RU"/>
-              </w:rPr>
-              <w:t>res</w:t>
-            </w:r>
-            <w:proofErr w:type="spellEnd"/>
-            <w:r>
-              <w:rPr>
-                <w:lang w:val="ru-RU"/>
-              </w:rPr>
-              <w:t>, "Ньютон (разд. назад)"</w:t>
-            </w:r>
-          </w:p>
-          <w:p>
-            <w:pPr>
-              <w:pStyle w:val="af2"/>
-              <w:rPr>
-                <w:lang w:val="ru-RU"/>
-              </w:rPr>
-            </w:pPr>
-          </w:p>
-          <w:p>
-            <w:pPr>
-              <w:pStyle w:val="af2"/>
-            </w:pPr>
-            <w:r>
-              <w:rPr>
-                <w:lang w:val="ru-RU"/>
-              </w:rPr>
-              <w:t xml:space="preserve">    </w:t>
-            </w:r>
-            <w:r>
-              <w:t>@staticmethod</w:t>
-            </w:r>
-          </w:p>
-          <w:p>
-            <w:pPr>
-              <w:pStyle w:val="af2"/>
-            </w:pPr>
-            <w:r>
-              <w:t xml:space="preserve">    def </w:t>
-            </w:r>
-            <w:proofErr w:type="spellStart"/>
-            <w:r>
-              <w:t>newton_finite_</w:t>
-            </w:r>
-            <w:proofErr w:type="gramStart"/>
-            <w:r>
-              <w:t>auto</w:t>
-            </w:r>
-            <w:proofErr w:type="spellEnd"/>
-            <w:r>
-              <w:t>(</w:t>
-            </w:r>
-            <w:proofErr w:type="spellStart"/>
-            <w:proofErr w:type="gramEnd"/>
-            <w:r>
-              <w:t>x_pts</w:t>
-            </w:r>
-            <w:proofErr w:type="spellEnd"/>
-            <w:r>
-              <w:t xml:space="preserve">, y_pts, </w:t>
-            </w:r>
-            <w:proofErr w:type="spellStart"/>
-            <w:r>
-              <w:t>x_val</w:t>
-            </w:r>
-            <w:proofErr w:type="spellEnd"/>
-            <w:r>
-              <w:t>):</w:t>
-            </w:r>
-          </w:p>
-          <w:p>
-            <w:pPr>
-              <w:pStyle w:val="af2"/>
-            </w:pPr>
-            <w:r>
-              <w:t xml:space="preserve">        n = </w:t>
-            </w:r>
-            <w:proofErr w:type="spellStart"/>
-            <w:r>
-              <w:t>len</w:t>
-            </w:r>
-            <w:proofErr w:type="spellEnd"/>
-            <w:r>
-              <w:t>(</w:t>
-            </w:r>
-            <w:proofErr w:type="spellStart"/>
-            <w:r>
-              <w:t>x_pts</w:t>
-            </w:r>
-            <w:proofErr w:type="spellEnd"/>
-            <w:r>
-              <w:t>)</w:t>
-            </w:r>
-          </w:p>
-          <w:p>
-            <w:pPr>
-              <w:pStyle w:val="af2"/>
-            </w:pPr>
-            <w:r>
-              <w:t xml:space="preserve">        h = </w:t>
-            </w:r>
-            <w:proofErr w:type="spellStart"/>
-            <w:r>
-              <w:t>x_</w:t>
-            </w:r>
-            <w:proofErr w:type="gramStart"/>
-            <w:r>
-              <w:t>pts</w:t>
-            </w:r>
-            <w:proofErr w:type="spellEnd"/>
-            <w:r>
-              <w:t>[</w:t>
-            </w:r>
-            <w:proofErr w:type="gramEnd"/>
-            <w:r>
-              <w:t xml:space="preserve">1] - </w:t>
-            </w:r>
-            <w:proofErr w:type="spellStart"/>
-            <w:r>
-              <w:t>x_pts</w:t>
-            </w:r>
-            <w:proofErr w:type="spellEnd"/>
-            <w:r>
-              <w:t>[0]</w:t>
-            </w:r>
-          </w:p>
-          <w:p>
-            <w:pPr>
-              <w:pStyle w:val="af2"/>
-            </w:pPr>
-            <w:r>
-              <w:t xml:space="preserve">        diffs = </w:t>
-            </w:r>
-            <w:proofErr w:type="spellStart"/>
-            <w:r>
-              <w:t>InterpolationMath.get_finite_diffs</w:t>
-            </w:r>
-            <w:proofErr w:type="spellEnd"/>
-            <w:r>
-              <w:t>(</w:t>
-            </w:r>
-            <w:proofErr w:type="spellStart"/>
-            <w:r>
-              <w:t>y_pts</w:t>
-            </w:r>
-            <w:proofErr w:type="spellEnd"/>
-            <w:r>
-              <w:t>)</w:t>
-            </w:r>
-          </w:p>
-          <w:p>
-            <w:pPr>
-              <w:pStyle w:val="af2"/>
-            </w:pPr>
-            <w:r>
-              <w:t xml:space="preserve">        </w:t>
-            </w:r>
-            <w:proofErr w:type="spellStart"/>
-            <w:r>
-              <w:t>mid_idx</w:t>
-            </w:r>
-            <w:proofErr w:type="spellEnd"/>
-            <w:r>
-              <w:t xml:space="preserve"> = n // 2</w:t>
-            </w:r>
-          </w:p>
-          <w:p>
-            <w:pPr>
-              <w:pStyle w:val="af2"/>
-            </w:pPr>
-            <w:r>
-              <w:t xml:space="preserve">        if </w:t>
-            </w:r>
-            <w:proofErr w:type="spellStart"/>
-            <w:r>
-              <w:t>x_val</w:t>
-            </w:r>
-            <w:proofErr w:type="spellEnd"/>
-            <w:r>
-              <w:t xml:space="preserve"> &lt;= </w:t>
-            </w:r>
-            <w:proofErr w:type="spellStart"/>
-            <w:r>
-              <w:t>x_pts</w:t>
-            </w:r>
-            <w:proofErr w:type="spellEnd"/>
-            <w:r>
-              <w:t>[</w:t>
-            </w:r>
-            <w:proofErr w:type="spellStart"/>
-            <w:r>
-              <w:t>mid_idx</w:t>
-            </w:r>
-            <w:proofErr w:type="spellEnd"/>
-            <w:r>
-              <w:t>]:</w:t>
-            </w:r>
-          </w:p>
-          <w:p>
-            <w:pPr>
-              <w:pStyle w:val="af2"/>
-              <w:rPr>
-                <w:lang w:val="ru-RU"/>
-              </w:rPr>
-            </w:pPr>
-            <w:r>
-              <w:t xml:space="preserve">            </w:t>
-            </w:r>
-            <w:r>
-              <w:rPr>
-                <w:lang w:val="ru-RU"/>
-              </w:rPr>
-              <w:t># 1-я формула (вперед)</w:t>
-            </w:r>
-          </w:p>
-          <w:p>
-            <w:pPr>
-              <w:pStyle w:val="af2"/>
-            </w:pPr>
-            <w:r>
-              <w:rPr>
-                <w:lang w:val="ru-RU"/>
-              </w:rPr>
-              <w:t xml:space="preserve">            </w:t>
-            </w:r>
-            <w:r>
-              <w:t>t = (</w:t>
-            </w:r>
-            <w:proofErr w:type="spellStart"/>
-            <w:r>
-              <w:t>x_val</w:t>
-            </w:r>
-            <w:proofErr w:type="spellEnd"/>
-            <w:r>
-              <w:t xml:space="preserve"> - </w:t>
-            </w:r>
-            <w:proofErr w:type="spellStart"/>
-            <w:r>
-              <w:t>x_</w:t>
-            </w:r>
-            <w:proofErr w:type="gramStart"/>
-            <w:r>
-              <w:t>pts</w:t>
-            </w:r>
-            <w:proofErr w:type="spellEnd"/>
-            <w:r>
-              <w:t>[</w:t>
-            </w:r>
-            <w:proofErr w:type="gramEnd"/>
-            <w:r>
-              <w:t>0]) / h</w:t>
-            </w:r>
-          </w:p>
-          <w:p>
-            <w:pPr>
-              <w:pStyle w:val="af2"/>
-            </w:pPr>
-            <w:r>
-              <w:t xml:space="preserve">            </w:t>
-            </w:r>
-            <w:r>
-              <w:t>res = float(</w:t>
-            </w:r>
-            <w:proofErr w:type="spellStart"/>
-            <w:r>
-              <w:t>y_</w:t>
-            </w:r>
-            <w:proofErr w:type="gramStart"/>
-            <w:r>
-              <w:t>pts</w:t>
-            </w:r>
-            <w:proofErr w:type="spellEnd"/>
-            <w:r>
-              <w:t>[</w:t>
-            </w:r>
-            <w:proofErr w:type="gramEnd"/>
-            <w:r>
-              <w:t>0])</w:t>
-            </w:r>
-          </w:p>
-          <w:p>
-            <w:pPr>
-              <w:pStyle w:val="af2"/>
-            </w:pPr>
-            <w:r>
-              <w:t>            term = 1.0</w:t>
-            </w:r>
-          </w:p>
-          <w:p>
-            <w:pPr>
-              <w:pStyle w:val="af2"/>
-            </w:pPr>
-            <w:r>
-              <w:t xml:space="preserve">            for </w:t>
-            </w:r>
-            <w:proofErr w:type="spellStart"/>
-            <w:r>
-              <w:t>i</w:t>
-            </w:r>
-            <w:proofErr w:type="spellEnd"/>
-            <w:r>
-              <w:t xml:space="preserve"> in </w:t>
-            </w:r>
-            <w:proofErr w:type="gramStart"/>
-            <w:r>
-              <w:t>range(</w:t>
-            </w:r>
-            <w:proofErr w:type="gramEnd"/>
-            <w:r>
-              <w:t>1, n):</w:t>
-            </w:r>
-          </w:p>
-          <w:p>
-            <w:pPr>
-              <w:pStyle w:val="af2"/>
-            </w:pPr>
-            <w:r>
-              <w:t xml:space="preserve">                term *= t - </w:t>
-            </w:r>
-            <w:proofErr w:type="spellStart"/>
-            <w:r>
-              <w:t>i</w:t>
-            </w:r>
-            <w:proofErr w:type="spellEnd"/>
-            <w:r>
-              <w:t xml:space="preserve"> + 1</w:t>
-            </w:r>
-          </w:p>
-          <w:p>
-            <w:pPr>
-              <w:pStyle w:val="af2"/>
-            </w:pPr>
-            <w:r>
-              <w:t>                res += (term * float(diffs[</w:t>
-            </w:r>
-            <w:proofErr w:type="spellStart"/>
-            <w:r>
-              <w:t>i</w:t>
-            </w:r>
-            <w:proofErr w:type="spellEnd"/>
-            <w:r>
-              <w:t>][0])) / factorial(</w:t>
-            </w:r>
-            <w:proofErr w:type="spellStart"/>
-            <w:r>
-              <w:t>i</w:t>
-            </w:r>
-            <w:proofErr w:type="spellEnd"/>
-            <w:r>
-              <w:t>)</w:t>
-            </w:r>
-          </w:p>
-          <w:p>
-            <w:pPr>
-              <w:pStyle w:val="af2"/>
-              <w:rPr>
-                <w:lang w:val="ru-RU"/>
-              </w:rPr>
-            </w:pPr>
-            <w:r>
-              <w:t xml:space="preserve">            </w:t>
-            </w:r>
-            <w:proofErr w:type="spellStart"/>
-            <w:r>
-              <w:rPr>
-                <w:lang w:val="ru-RU"/>
-              </w:rPr>
-              <w:t>return</w:t>
-            </w:r>
-            <w:proofErr w:type="spellEnd"/>
-            <w:r>
-              <w:rPr>
-                <w:lang w:val="ru-RU"/>
-              </w:rPr>
-              <w:t xml:space="preserve"> </w:t>
-            </w:r>
-            <w:proofErr w:type="spellStart"/>
-            <w:r>
-              <w:rPr>
-                <w:lang w:val="ru-RU"/>
-              </w:rPr>
-              <w:t>res</w:t>
-            </w:r>
-            <w:proofErr w:type="spellEnd"/>
-            <w:r>
-              <w:rPr>
-                <w:lang w:val="ru-RU"/>
-              </w:rPr>
-              <w:t>, "Ньютон (кон. вперед)"</w:t>
-            </w:r>
-          </w:p>
-          <w:p>
-            <w:pPr>
-              <w:pStyle w:val="af2"/>
-              <w:rPr>
-                <w:lang w:val="ru-RU"/>
-              </w:rPr>
-            </w:pPr>
-            <w:r>
-              <w:rPr>
-                <w:lang w:val="ru-RU"/>
-              </w:rPr>
-              <w:t xml:space="preserve">        </w:t>
-            </w:r>
-            <w:proofErr w:type="spellStart"/>
-            <w:r>
-              <w:rPr>
-                <w:lang w:val="ru-RU"/>
-              </w:rPr>
-              <w:t>else</w:t>
-            </w:r>
-            <w:proofErr w:type="spellEnd"/>
-            <w:r>
-              <w:rPr>
-                <w:lang w:val="ru-RU"/>
-              </w:rPr>
-              <w:t>:</w:t>
-            </w:r>
-          </w:p>
-          <w:p>
-            <w:pPr>
-              <w:pStyle w:val="af2"/>
-              <w:rPr>
-                <w:lang w:val="ru-RU"/>
-              </w:rPr>
-            </w:pPr>
-            <w:r>
-              <w:rPr>
-                <w:lang w:val="ru-RU"/>
-              </w:rPr>
-              <w:t>            # 2-я формула (назад)</w:t>
-            </w:r>
-          </w:p>
-          <w:p>
-            <w:pPr>
-              <w:pStyle w:val="af2"/>
-            </w:pPr>
-            <w:r>
-              <w:rPr>
-                <w:lang w:val="ru-RU"/>
-              </w:rPr>
-              <w:t xml:space="preserve">            </w:t>
-            </w:r>
-            <w:r>
-              <w:t>t = (</w:t>
-            </w:r>
-            <w:proofErr w:type="spellStart"/>
-            <w:r>
-              <w:t>x_val</w:t>
-            </w:r>
-            <w:proofErr w:type="spellEnd"/>
-            <w:r>
-              <w:t xml:space="preserve"> - </w:t>
-            </w:r>
-            <w:proofErr w:type="spellStart"/>
-            <w:r>
-              <w:t>x_</w:t>
-            </w:r>
-            <w:proofErr w:type="gramStart"/>
-            <w:r>
-              <w:t>pts</w:t>
-            </w:r>
-            <w:proofErr w:type="spellEnd"/>
-            <w:r>
-              <w:t>[</w:t>
-            </w:r>
-            <w:proofErr w:type="gramEnd"/>
-            <w:r>
-              <w:t>n - 1]) / h</w:t>
-            </w:r>
-          </w:p>
-          <w:p>
-            <w:pPr>
-              <w:pStyle w:val="af2"/>
-            </w:pPr>
-            <w:r>
-              <w:t xml:space="preserve">            </w:t>
-            </w:r>
-            <w:r>
-              <w:t xml:space="preserve">res = </w:t>
-            </w:r>
-            <w:proofErr w:type="gramStart"/>
-            <w:r>
-              <w:t>float(</w:t>
-            </w:r>
-            <w:proofErr w:type="spellStart"/>
-            <w:proofErr w:type="gramEnd"/>
-            <w:r>
-              <w:t>y_pts</w:t>
-            </w:r>
-            <w:proofErr w:type="spellEnd"/>
-            <w:r>
-              <w:t>[n - 1])</w:t>
-            </w:r>
-          </w:p>
-          <w:p>
-            <w:pPr>
-              <w:pStyle w:val="af2"/>
-            </w:pPr>
-            <w:r>
-              <w:t>            term = 1.0</w:t>
-            </w:r>
-          </w:p>
-          <w:p>
-            <w:pPr>
-              <w:pStyle w:val="af2"/>
-            </w:pPr>
-            <w:r>
-              <w:t xml:space="preserve">            for </w:t>
-            </w:r>
-            <w:proofErr w:type="spellStart"/>
-            <w:r>
-              <w:t>i</w:t>
-            </w:r>
-            <w:proofErr w:type="spellEnd"/>
-            <w:r>
-              <w:t xml:space="preserve"> in </w:t>
-            </w:r>
-            <w:proofErr w:type="gramStart"/>
-            <w:r>
-              <w:t>range(</w:t>
-            </w:r>
-            <w:proofErr w:type="gramEnd"/>
-            <w:r>
-              <w:t>1, n):</w:t>
-            </w:r>
-          </w:p>
-          <w:p>
-            <w:pPr>
-              <w:pStyle w:val="af2"/>
-            </w:pPr>
-            <w:r>
-              <w:t xml:space="preserve">                term *= t + </w:t>
-            </w:r>
-            <w:proofErr w:type="spellStart"/>
-            <w:r>
-              <w:t>i</w:t>
-            </w:r>
-            <w:proofErr w:type="spellEnd"/>
-            <w:r>
-              <w:t xml:space="preserve"> - 1</w:t>
-            </w:r>
-          </w:p>
-          <w:p>
-            <w:pPr>
-              <w:pStyle w:val="af2"/>
-            </w:pPr>
-            <w:r>
-              <w:t>                res += (term * float(diffs[</w:t>
-            </w:r>
-            <w:proofErr w:type="spellStart"/>
-            <w:r>
-              <w:t>i</w:t>
-            </w:r>
-            <w:proofErr w:type="spellEnd"/>
-            <w:proofErr w:type="gramStart"/>
-            <w:r>
-              <w:t>][</w:t>
-            </w:r>
-            <w:proofErr w:type="gramEnd"/>
-            <w:r>
-              <w:t>-1])) / factorial(</w:t>
-            </w:r>
-            <w:proofErr w:type="spellStart"/>
-            <w:r>
-              <w:t>i</w:t>
-            </w:r>
-            <w:proofErr w:type="spellEnd"/>
-            <w:r>
-              <w:t>)</w:t>
-            </w:r>
-          </w:p>
-          <w:p>
-            <w:pPr>
-              <w:pStyle w:val="af2"/>
-              <w:rPr>
-                <w:lang w:val="ru-RU"/>
-              </w:rPr>
-            </w:pPr>
-            <w:r>
-              <w:t xml:space="preserve">            </w:t>
-            </w:r>
-            <w:proofErr w:type="spellStart"/>
-            <w:r>
-              <w:rPr>
-                <w:lang w:val="ru-RU"/>
-              </w:rPr>
-              <w:t>return</w:t>
-            </w:r>
-            <w:proofErr w:type="spellEnd"/>
-            <w:r>
-              <w:rPr>
-                <w:lang w:val="ru-RU"/>
-              </w:rPr>
-              <w:t xml:space="preserve"> </w:t>
-            </w:r>
-            <w:proofErr w:type="spellStart"/>
-            <w:r>
-              <w:rPr>
-                <w:lang w:val="ru-RU"/>
-              </w:rPr>
-              <w:t>res</w:t>
-            </w:r>
-            <w:proofErr w:type="spellEnd"/>
-            <w:r>
-              <w:rPr>
-                <w:lang w:val="ru-RU"/>
-              </w:rPr>
-              <w:t>, "Ньютон (кон. назад)"</w:t>
-            </w:r>
-          </w:p>
-          <w:p>
-            <w:pPr>
-              <w:pStyle w:val="af2"/>
-              <w:rPr>
-                <w:lang w:val="ru-RU"/>
-              </w:rPr>
-            </w:pPr>
-          </w:p>
-          <w:p>
-            <w:pPr>
-              <w:pStyle w:val="af2"/>
-            </w:pPr>
-            <w:r>
-              <w:rPr>
-                <w:lang w:val="ru-RU"/>
-              </w:rPr>
-              <w:t xml:space="preserve">    </w:t>
-            </w:r>
-            <w:r>
-              <w:t>@staticmethod</w:t>
-            </w:r>
-          </w:p>
-          <w:p>
-            <w:pPr>
-              <w:pStyle w:val="af2"/>
-            </w:pPr>
-            <w:r>
-              <w:t xml:space="preserve">    def </w:t>
-            </w:r>
-            <w:proofErr w:type="spellStart"/>
-            <w:proofErr w:type="gramStart"/>
-            <w:r>
-              <w:t>stirling</w:t>
-            </w:r>
-            <w:proofErr w:type="spellEnd"/>
-            <w:r>
-              <w:t>(</w:t>
-            </w:r>
-            <w:proofErr w:type="spellStart"/>
-            <w:proofErr w:type="gramEnd"/>
-            <w:r>
-              <w:t>x_pts</w:t>
-            </w:r>
-            <w:proofErr w:type="spellEnd"/>
-            <w:r>
-              <w:t xml:space="preserve">, </w:t>
-            </w:r>
-            <w:proofErr w:type="spellStart"/>
-            <w:r>
-              <w:t>y_pts</w:t>
-            </w:r>
-            <w:proofErr w:type="spellEnd"/>
-            <w:r>
-              <w:t xml:space="preserve">, </w:t>
-            </w:r>
-            <w:proofErr w:type="spellStart"/>
-            <w:r>
-              <w:t>x_val</w:t>
-            </w:r>
-            <w:proofErr w:type="spellEnd"/>
-            <w:r>
-              <w:t>, diffs):</w:t>
-            </w:r>
-          </w:p>
-          <w:p>
-            <w:pPr>
-              <w:pStyle w:val="af2"/>
-            </w:pPr>
-            <w:r>
-              <w:t xml:space="preserve">        n = </w:t>
-            </w:r>
-            <w:proofErr w:type="spellStart"/>
-            <w:r>
-              <w:t>len</w:t>
-            </w:r>
-            <w:proofErr w:type="spellEnd"/>
-            <w:r>
-              <w:t>(</w:t>
-            </w:r>
-            <w:proofErr w:type="spellStart"/>
-            <w:r>
-              <w:t>x_pts</w:t>
-            </w:r>
-            <w:proofErr w:type="spellEnd"/>
-            <w:r>
-              <w:t>)</w:t>
-            </w:r>
-          </w:p>
-          <w:p>
-            <w:pPr>
-              <w:pStyle w:val="af2"/>
-            </w:pPr>
-            <w:r>
-              <w:t>        mid = n // 2</w:t>
-            </w:r>
-          </w:p>
-          <w:p>
-            <w:pPr>
-              <w:pStyle w:val="af2"/>
-            </w:pPr>
-            <w:r>
-              <w:t xml:space="preserve">        h = </w:t>
-            </w:r>
-            <w:proofErr w:type="spellStart"/>
-            <w:r>
-              <w:t>x_</w:t>
-            </w:r>
-            <w:proofErr w:type="gramStart"/>
-            <w:r>
-              <w:t>pts</w:t>
-            </w:r>
-            <w:proofErr w:type="spellEnd"/>
-            <w:r>
-              <w:t>[</w:t>
-            </w:r>
-            <w:proofErr w:type="gramEnd"/>
-            <w:r>
-              <w:t xml:space="preserve">1] - </w:t>
-            </w:r>
-            <w:proofErr w:type="spellStart"/>
-            <w:r>
-              <w:t>x_pts</w:t>
-            </w:r>
-            <w:proofErr w:type="spellEnd"/>
-            <w:r>
-              <w:t>[0]</w:t>
-            </w:r>
-          </w:p>
-          <w:p>
-            <w:pPr>
-              <w:pStyle w:val="af2"/>
-            </w:pPr>
-            <w:r>
-              <w:t>        t = (</w:t>
-            </w:r>
-            <w:proofErr w:type="spellStart"/>
-            <w:r>
-              <w:t>x_val</w:t>
-            </w:r>
-            <w:proofErr w:type="spellEnd"/>
-            <w:r>
-              <w:t xml:space="preserve"> - </w:t>
-            </w:r>
-            <w:proofErr w:type="spellStart"/>
-            <w:r>
-              <w:t>x_pts</w:t>
-            </w:r>
-            <w:proofErr w:type="spellEnd"/>
-            <w:r>
-              <w:t>[mid]) / h</w:t>
-            </w:r>
-          </w:p>
-          <w:p>
-            <w:pPr>
-              <w:pStyle w:val="af2"/>
-            </w:pPr>
-            <w:r>
-              <w:t xml:space="preserve">        res = </w:t>
-            </w:r>
-            <w:proofErr w:type="spellStart"/>
-            <w:r>
-              <w:t>y_pts</w:t>
-            </w:r>
-            <w:proofErr w:type="spellEnd"/>
-            <w:r>
-              <w:t>[mid]</w:t>
-            </w:r>
-          </w:p>
-          <w:p>
-            <w:pPr>
-              <w:pStyle w:val="af2"/>
-            </w:pPr>
-            <w:r>
-              <w:lastRenderedPageBreak/>
-              <w:t>        try:</w:t>
-            </w:r>
-          </w:p>
-          <w:p>
-            <w:pPr>
-              <w:pStyle w:val="af2"/>
-            </w:pPr>
-            <w:r>
-              <w:t>            res += (</w:t>
-            </w:r>
-          </w:p>
-          <w:p>
-            <w:pPr>
-              <w:pStyle w:val="af2"/>
-            </w:pPr>
-            <w:r>
-              <w:t>                t * (</w:t>
-            </w:r>
-            <w:proofErr w:type="gramStart"/>
-            <w:r>
-              <w:t>diffs[</w:t>
-            </w:r>
-            <w:proofErr w:type="gramEnd"/>
-            <w:r>
-              <w:t>1][mid - 1] + diffs[1][mid]) / 2</w:t>
-            </w:r>
-          </w:p>
-          <w:p>
-            <w:pPr>
-              <w:pStyle w:val="af2"/>
-            </w:pPr>
-            <w:r>
-              <w:t xml:space="preserve">                + (t**2 / 2) * </w:t>
-            </w:r>
-            <w:proofErr w:type="gramStart"/>
-            <w:r>
-              <w:t>diffs[</w:t>
-            </w:r>
-            <w:proofErr w:type="gramEnd"/>
-            <w:r>
-              <w:t>2][mid - 1]</w:t>
-            </w:r>
-          </w:p>
-          <w:p>
-            <w:pPr>
-              <w:pStyle w:val="af2"/>
-            </w:pPr>
-            <w:r>
-              <w:t>            )</w:t>
-            </w:r>
-          </w:p>
-          <w:p>
-            <w:pPr>
-              <w:pStyle w:val="af2"/>
-            </w:pPr>
-            <w:r>
-              <w:t>        except:</w:t>
-            </w:r>
-          </w:p>
-          <w:p>
-            <w:pPr>
-              <w:pStyle w:val="af2"/>
-            </w:pPr>
-            <w:r>
-              <w:t>            pass</w:t>
-            </w:r>
-          </w:p>
-          <w:p>
-            <w:pPr>
-              <w:pStyle w:val="af2"/>
-            </w:pPr>
-            <w:r>
-              <w:t>        return res</w:t>
-            </w:r>
-          </w:p>
-          <w:p>
-            <w:pPr>
-              <w:pStyle w:val="af2"/>
-            </w:pPr>
-          </w:p>
-          <w:p>
-            <w:pPr>
-              <w:pStyle w:val="af2"/>
-            </w:pPr>
-            <w:r>
-              <w:t>    @staticmethod</w:t>
-            </w:r>
-          </w:p>
-          <w:p>
-            <w:pPr>
-              <w:pStyle w:val="af2"/>
-            </w:pPr>
-            <w:r>
-              <w:t xml:space="preserve">    def </w:t>
-            </w:r>
-            <w:proofErr w:type="spellStart"/>
-            <w:proofErr w:type="gramStart"/>
-            <w:r>
-              <w:t>bessel</w:t>
-            </w:r>
-            <w:proofErr w:type="spellEnd"/>
-            <w:r>
-              <w:t>(</w:t>
-            </w:r>
-            <w:proofErr w:type="spellStart"/>
-            <w:proofErr w:type="gramEnd"/>
-            <w:r>
-              <w:t>x_pts</w:t>
-            </w:r>
-            <w:proofErr w:type="spellEnd"/>
-            <w:r>
-              <w:t xml:space="preserve">, </w:t>
-            </w:r>
-            <w:proofErr w:type="spellStart"/>
-            <w:r>
-              <w:t>y_pts</w:t>
-            </w:r>
-            <w:proofErr w:type="spellEnd"/>
-            <w:r>
-              <w:t xml:space="preserve">, </w:t>
-            </w:r>
-            <w:proofErr w:type="spellStart"/>
-            <w:r>
-              <w:t>x_val</w:t>
-            </w:r>
-            <w:proofErr w:type="spellEnd"/>
-            <w:r>
-              <w:t>, diffs):</w:t>
-            </w:r>
-          </w:p>
-          <w:p>
-            <w:pPr>
-              <w:pStyle w:val="af2"/>
-            </w:pPr>
-            <w:r>
-              <w:t xml:space="preserve">        n = </w:t>
-            </w:r>
-            <w:proofErr w:type="spellStart"/>
-            <w:r>
-              <w:t>len</w:t>
-            </w:r>
-            <w:proofErr w:type="spellEnd"/>
-            <w:r>
-              <w:t>(</w:t>
-            </w:r>
-            <w:proofErr w:type="spellStart"/>
-            <w:r>
-              <w:t>x_pts</w:t>
-            </w:r>
-            <w:proofErr w:type="spellEnd"/>
-            <w:r>
-              <w:t>)</w:t>
-            </w:r>
-          </w:p>
-          <w:p>
-            <w:pPr>
-              <w:pStyle w:val="af2"/>
-            </w:pPr>
-            <w:r>
-              <w:t>        mid = (n - 1) // 2</w:t>
-            </w:r>
-          </w:p>
-          <w:p>
-            <w:pPr>
-              <w:pStyle w:val="af2"/>
-            </w:pPr>
-            <w:r>
-              <w:t xml:space="preserve">        h = </w:t>
-            </w:r>
-            <w:proofErr w:type="spellStart"/>
-            <w:r>
-              <w:t>x_</w:t>
-            </w:r>
-            <w:proofErr w:type="gramStart"/>
-            <w:r>
-              <w:t>pts</w:t>
-            </w:r>
-            <w:proofErr w:type="spellEnd"/>
-            <w:r>
-              <w:t>[</w:t>
-            </w:r>
-            <w:proofErr w:type="gramEnd"/>
-            <w:r>
-              <w:t xml:space="preserve">1] - </w:t>
-            </w:r>
-            <w:proofErr w:type="spellStart"/>
-            <w:r>
-              <w:t>x_pts</w:t>
-            </w:r>
-            <w:proofErr w:type="spellEnd"/>
-            <w:r>
-              <w:t>[0]</w:t>
-            </w:r>
-          </w:p>
-          <w:p>
-            <w:pPr>
-              <w:pStyle w:val="af2"/>
-            </w:pPr>
-            <w:r>
-              <w:t>        t = (</w:t>
-            </w:r>
-            <w:proofErr w:type="spellStart"/>
-            <w:r>
-              <w:t>x_val</w:t>
-            </w:r>
-            <w:proofErr w:type="spellEnd"/>
-            <w:r>
-              <w:t xml:space="preserve"> - </w:t>
-            </w:r>
-            <w:proofErr w:type="spellStart"/>
-            <w:r>
-              <w:t>x_pts</w:t>
-            </w:r>
-            <w:proofErr w:type="spellEnd"/>
-            <w:r>
-              <w:t>[mid]) / h</w:t>
-            </w:r>
-          </w:p>
-          <w:p>
-            <w:pPr>
-              <w:pStyle w:val="af2"/>
-            </w:pPr>
-            <w:r>
-              <w:t>        res = (</w:t>
-            </w:r>
-            <w:proofErr w:type="spellStart"/>
-            <w:r>
-              <w:t>y_pts</w:t>
-            </w:r>
-            <w:proofErr w:type="spellEnd"/>
-            <w:r>
-              <w:t xml:space="preserve">[mid] + </w:t>
-            </w:r>
-            <w:proofErr w:type="spellStart"/>
-            <w:r>
-              <w:t>y_</w:t>
-            </w:r>
-            <w:proofErr w:type="gramStart"/>
-            <w:r>
-              <w:t>pts</w:t>
-            </w:r>
-            <w:proofErr w:type="spellEnd"/>
-            <w:r>
-              <w:t>[</w:t>
-            </w:r>
-            <w:proofErr w:type="gramEnd"/>
-            <w:r>
-              <w:t>mid + 1]) / 2 + (t - 0.5) * diffs[1][mid]</w:t>
-            </w:r>
-          </w:p>
-          <w:p>
-            <w:pPr>
-              <w:pStyle w:val="af2"/>
-            </w:pPr>
-            <w:r>
-              <w:t>        try:</w:t>
-            </w:r>
-          </w:p>
-          <w:p>
-            <w:pPr>
-              <w:pStyle w:val="af2"/>
-            </w:pPr>
-            <w:r>
-              <w:t>            res += (t * (t - 1) / 2) * (</w:t>
-            </w:r>
-            <w:proofErr w:type="gramStart"/>
-            <w:r>
-              <w:t>diffs[</w:t>
-            </w:r>
-            <w:proofErr w:type="gramEnd"/>
-            <w:r>
-              <w:t>2][mid - 1] + diffs[2][mid]) / 2</w:t>
-            </w:r>
-          </w:p>
-          <w:p>
-            <w:pPr>
-              <w:pStyle w:val="af2"/>
-              <w:rPr>
-                <w:lang w:val="ru-RU"/>
-              </w:rPr>
-            </w:pPr>
-            <w:r>
-              <w:t xml:space="preserve">        </w:t>
-            </w:r>
-            <w:proofErr w:type="spellStart"/>
-            <w:r>
-              <w:rPr>
-                <w:lang w:val="ru-RU"/>
-              </w:rPr>
-              <w:t>except</w:t>
-            </w:r>
-            <w:proofErr w:type="spellEnd"/>
-            <w:r>
-              <w:rPr>
-                <w:lang w:val="ru-RU"/>
-              </w:rPr>
-              <w:t>:</w:t>
-            </w:r>
-          </w:p>
-          <w:p>
-            <w:pPr>
-              <w:pStyle w:val="af2"/>
-              <w:rPr>
-                <w:lang w:val="ru-RU"/>
-              </w:rPr>
-            </w:pPr>
-            <w:r>
-              <w:rPr>
-                <w:lang w:val="ru-RU"/>
-              </w:rPr>
-              <w:t xml:space="preserve">            </w:t>
-            </w:r>
-            <w:proofErr w:type="spellStart"/>
-            <w:r>
-              <w:rPr>
-                <w:lang w:val="ru-RU"/>
-              </w:rPr>
-              <w:t>pass</w:t>
-            </w:r>
-            <w:proofErr w:type="spellEnd"/>
-          </w:p>
-          <w:p>
-            <w:pPr>
-              <w:pStyle w:val="af2"/>
-              <w:rPr>
-                <w:lang w:val="ru-RU"/>
-              </w:rPr>
-            </w:pPr>
-            <w:r>
-              <w:rPr>
-                <w:lang w:val="ru-RU"/>
-              </w:rPr>
-              <w:t xml:space="preserve">        </w:t>
-            </w:r>
-            <w:proofErr w:type="spellStart"/>
-            <w:r>
-              <w:rPr>
-                <w:lang w:val="ru-RU"/>
-              </w:rPr>
-              <w:t>return</w:t>
-            </w:r>
-            <w:proofErr w:type="spellEnd"/>
-            <w:r>
-              <w:rPr>
-                <w:lang w:val="ru-RU"/>
-              </w:rPr>
-              <w:t xml:space="preserve"> </w:t>
-            </w:r>
-            <w:proofErr w:type="spellStart"/>
-            <w:r>
-              <w:rPr>
-                <w:lang w:val="ru-RU"/>
-              </w:rPr>
-              <w:t>res</w:t>
-            </w:r>
-            <w:proofErr w:type="spellEnd"/>
           </w:p>
           <w:p>
             <w:pPr>

</xml_diff>